<commit_message>
fix: validate every menu entry - real System Audit Logs screen, right tabs, true key labels, role-correct menus
- System Audit Logs opened the cashier drawer; User Management opened the drawer tab; separators were clickable entries
- key labels: Supplier Master F11, Ctrl+N bound, F5 = refresh; one key table used by bindings, labels and tests
- every entry opens its own tab; Masters > Inventory & Stock; exact page names only
- Inventory, Waste and the sales reports now need Masters / Accounts permission
- tests/test_menus.py; guide, screenshots and Help rebuilt

Co-Authored-By: Claude Sonnet 5.5 <noreply@anthropic.com>
</commit_message>
<xml_diff>
--- a/Docs/BillDesk_Native_User_Guide.docx
+++ b/Docs/BillDesk_Native_User_Guide.docx
@@ -4125,7 +4125,7 @@
                 <w:i w:val="0"/>
                 <w:sz w:val="19"/>
               </w:rPr>
-              <w:t>Item Master (F10), Customer Master (F4), Supplier Master (F5), Waste Management</w:t>
+              <w:t>Item Master (F10), Customer Master (F4), Supplier Master (F11), Inventory &amp; Stock, Waste Management</w:t>
             </w:r>
           </w:p>
         </w:tc>
@@ -12331,11 +12331,11 @@
               <a:graphicData uri="http://schemas.openxmlformats.org/drawingml/2006/picture">
                 <pic:pic>
                   <pic:nvPicPr>
-                    <pic:cNvPr id="0" name="42-new-order.png"/>
+                    <pic:cNvPr id="0" name="43-order-delivery-calendar.png"/>
                     <pic:cNvPicPr/>
                   </pic:nvPicPr>
                   <pic:blipFill>
-                    <a:blip r:embed="rId35"/>
+                    <a:blip r:embed="rId36"/>
                     <a:stretch>
                       <a:fillRect/>
                     </a:stretch>
@@ -12727,7 +12727,7 @@
                     <pic:cNvPicPr/>
                   </pic:nvPicPr>
                   <pic:blipFill>
-                    <a:blip r:embed="rId36"/>
+                    <a:blip r:embed="rId37"/>
                     <a:stretch>
                       <a:fillRect/>
                     </a:stretch>
@@ -12978,7 +12978,7 @@
                     <pic:cNvPicPr/>
                   </pic:nvPicPr>
                   <pic:blipFill>
-                    <a:blip r:embed="rId37"/>
+                    <a:blip r:embed="rId38"/>
                     <a:stretch>
                       <a:fillRect/>
                     </a:stretch>
@@ -13457,95 +13457,6 @@
                 <pic:pic>
                   <pic:nvPicPr>
                     <pic:cNvPr id="0" name="46-order-matrix.png"/>
-                    <pic:cNvPicPr/>
-                  </pic:nvPicPr>
-                  <pic:blipFill>
-                    <a:blip r:embed="rId38"/>
-                    <a:stretch>
-                      <a:fillRect/>
-                    </a:stretch>
-                  </pic:blipFill>
-                  <pic:spPr>
-                    <a:xfrm>
-                      <a:off x="0" y="0"/>
-                      <a:ext cx="6120000" cy="3902609"/>
-                    </a:xfrm>
-                    <a:prstGeom prst="rect"/>
-                  </pic:spPr>
-                </pic:pic>
-              </a:graphicData>
-            </a:graphic>
-          </wp:inline>
-        </w:drawing>
-      </w:r>
-    </w:p>
-    <w:p>
-      <w:pPr>
-        <w:jc w:val="center"/>
-      </w:pPr>
-      <w:r>
-        <w:rPr>
-          <w:i/>
-          <w:color w:val="64748B"/>
-          <w:sz w:val="18"/>
-        </w:rPr>
-        <w:t>Order matrix</w:t>
-      </w:r>
-    </w:p>
-    <w:p>
-      <w:pPr>
-        <w:spacing w:after="40"/>
-        <w:ind w:left="510" w:hanging="312"/>
-      </w:pPr>
-      <w:r>
-        <w:t xml:space="preserve">•  </w:t>
-      </w:r>
-      <w:r>
-        <w:rPr>
-          <w:b/>
-          <w:i w:val="0"/>
-        </w:rPr>
-        <w:t>Delivery Date</w:t>
-      </w:r>
-      <w:r>
-        <w:rPr>
-          <w:b w:val="0"/>
-          <w:i w:val="0"/>
-        </w:rPr>
-        <w:t xml:space="preserve"> limits the matrix to orders due on that day (pick it from the calendar); </w:t>
-      </w:r>
-      <w:r>
-        <w:rPr>
-          <w:b/>
-          <w:i w:val="0"/>
-        </w:rPr>
-        <w:t>All</w:t>
-      </w:r>
-      <w:r>
-        <w:rPr>
-          <w:b w:val="0"/>
-          <w:i w:val="0"/>
-        </w:rPr>
-        <w:t xml:space="preserve"> shows every pending order.</w:t>
-      </w:r>
-    </w:p>
-    <w:p>
-      <w:pPr>
-        <w:jc w:val="center"/>
-      </w:pPr>
-      <w:r>
-        <w:drawing>
-          <wp:inline xmlns:a="http://schemas.openxmlformats.org/drawingml/2006/main" xmlns:pic="http://schemas.openxmlformats.org/drawingml/2006/picture">
-            <wp:extent cx="6120000" cy="3902609"/>
-            <wp:docPr id="33" name="Picture 33"/>
-            <wp:cNvGraphicFramePr>
-              <a:graphicFrameLocks noChangeAspect="1"/>
-            </wp:cNvGraphicFramePr>
-            <a:graphic>
-              <a:graphicData uri="http://schemas.openxmlformats.org/drawingml/2006/picture">
-                <pic:pic>
-                  <pic:nvPicPr>
-                    <pic:cNvPr id="0" name="47-order-matrix-by-date.png"/>
                     <pic:cNvPicPr/>
                   </pic:nvPicPr>
                   <pic:blipFill>
@@ -13578,7 +13489,7 @@
           <w:color w:val="64748B"/>
           <w:sz w:val="18"/>
         </w:rPr>
-        <w:t>Matrix for one delivery date</w:t>
+        <w:t>Order matrix</w:t>
       </w:r>
     </w:p>
     <w:p>
@@ -13594,150 +13505,28 @@
           <w:b/>
           <w:i w:val="0"/>
         </w:rPr>
-        <w:t>Show Stock</w:t>
-      </w:r>
-      <w:r>
-        <w:rPr>
-          <w:b w:val="0"/>
-          <w:i w:val="0"/>
-        </w:rPr>
-        <w:t xml:space="preserve"> and </w:t>
+        <w:t>Delivery Date</w:t>
+      </w:r>
+      <w:r>
+        <w:rPr>
+          <w:b w:val="0"/>
+          <w:i w:val="0"/>
+        </w:rPr>
+        <w:t xml:space="preserve"> limits the matrix to orders due on that day (pick it from the calendar); </w:t>
       </w:r>
       <w:r>
         <w:rPr>
           <w:b/>
           <w:i w:val="0"/>
         </w:rPr>
-        <w:t>Show To Purchase</w:t>
-      </w:r>
-      <w:r>
-        <w:rPr>
-          <w:b w:val="0"/>
-          <w:i w:val="0"/>
-        </w:rPr>
-        <w:t xml:space="preserve"> switch those columns; </w:t>
-      </w:r>
-      <w:r>
-        <w:rPr>
-          <w:b/>
-          <w:i w:val="0"/>
-        </w:rPr>
-        <w:t>Export to Excel</w:t>
-      </w:r>
-      <w:r>
-        <w:rPr>
-          <w:b w:val="0"/>
-          <w:i w:val="0"/>
-        </w:rPr>
-        <w:t xml:space="preserve"> and </w:t>
-      </w:r>
-      <w:r>
-        <w:rPr>
-          <w:b/>
-          <w:i w:val="0"/>
-        </w:rPr>
-        <w:t>Print Configuration</w:t>
-      </w:r>
-      <w:r>
-        <w:rPr>
-          <w:b w:val="0"/>
-          <w:i w:val="0"/>
-        </w:rPr>
-        <w:t xml:space="preserve"> produce a copy.</w:t>
-      </w:r>
-    </w:p>
-    <w:p>
-      <w:r>
-        <w:rPr>
-          <w:b/>
-        </w:rPr>
-        <w:t xml:space="preserve">See also: </w:t>
-      </w:r>
-      <w:hyperlink w:anchor="orders-list">
-        <w:r>
-          <w:rPr>
-            <w:color w:val="4F46E5"/>
-            <w:u w:val="single"/>
-          </w:rPr>
-          <w:t xml:space="preserve">Orders and shipments</w:t>
-        </w:r>
-      </w:hyperlink>
-      <w:r>
-        <w:t xml:space="preserve">  ·  </w:t>
-      </w:r>
-      <w:hyperlink w:anchor="inventory">
-        <w:r>
-          <w:rPr>
-            <w:color w:val="4F46E5"/>
-            <w:u w:val="single"/>
-          </w:rPr>
-          <w:t xml:space="preserve">Inventory: live stock</w:t>
-        </w:r>
-      </w:hyperlink>
-    </w:p>
-    <w:p>
-      <w:r>
-        <w:br w:type="page"/>
-      </w:r>
-    </w:p>
-    <w:p>
-      <w:bookmarkStart w:id="132" w:name="chapter-masters"/>
-      <w:pPr>
-        <w:pStyle w:val="Heading1"/>
-      </w:pPr>
-      <w:r>
-        <w:t>Chapter 5. Masters: items, customers, suppliers</w:t>
-      </w:r>
-      <w:bookmarkEnd w:id="132"/>
-    </w:p>
-    <w:p>
-      <w:bookmarkStart w:id="133" w:name="items"/>
-      <w:pPr>
-        <w:pStyle w:val="Heading2"/>
-      </w:pPr>
-      <w:r>
-        <w:t>5.1  Items</w:t>
-      </w:r>
-      <w:bookmarkEnd w:id="133"/>
-    </w:p>
-    <w:p>
-      <w:r>
-        <w:rPr>
-          <w:i/>
-          <w:color w:val="64748B"/>
-          <w:sz w:val="18"/>
-        </w:rPr>
-        <w:t>Screen: Item Master</w:t>
-      </w:r>
-    </w:p>
-    <w:p>
-      <w:r>
-        <w:rPr>
-          <w:b/>
-          <w:i w:val="0"/>
-        </w:rPr>
-        <w:t>Masters → Item Master</w:t>
-      </w:r>
-      <w:r>
-        <w:rPr>
-          <w:b w:val="0"/>
-          <w:i w:val="0"/>
-        </w:rPr>
-        <w:t xml:space="preserve"> (</w:t>
-      </w:r>
-      <w:r>
-        <w:rPr>
-          <w:b/>
-          <w:i w:val="0"/>
-        </w:rPr>
-        <w:t>F10</w:t>
-      </w:r>
-      <w:r>
-        <w:rPr>
-          <w:b w:val="0"/>
-          <w:i w:val="0"/>
-        </w:rPr>
-        <w:t>).</w:t>
+        <w:t>All</w:t>
+      </w:r>
+      <w:r>
+        <w:rPr>
+          <w:b w:val="0"/>
+          <w:i w:val="0"/>
+        </w:rPr>
+        <w:t xml:space="preserve"> shows every pending order.</w:t>
       </w:r>
     </w:p>
     <w:p>
@@ -13748,7 +13537,7 @@
         <w:drawing>
           <wp:inline xmlns:a="http://schemas.openxmlformats.org/drawingml/2006/main" xmlns:pic="http://schemas.openxmlformats.org/drawingml/2006/picture">
             <wp:extent cx="6120000" cy="3902609"/>
-            <wp:docPr id="34" name="Picture 34"/>
+            <wp:docPr id="33" name="Picture 33"/>
             <wp:cNvGraphicFramePr>
               <a:graphicFrameLocks noChangeAspect="1"/>
             </wp:cNvGraphicFramePr>
@@ -13756,7 +13545,7 @@
               <a:graphicData uri="http://schemas.openxmlformats.org/drawingml/2006/picture">
                 <pic:pic>
                   <pic:nvPicPr>
-                    <pic:cNvPr id="0" name="50-items.png"/>
+                    <pic:cNvPr id="0" name="47-order-matrix-by-date.png"/>
                     <pic:cNvPicPr/>
                   </pic:nvPicPr>
                   <pic:blipFill>
@@ -13789,6 +13578,217 @@
           <w:color w:val="64748B"/>
           <w:sz w:val="18"/>
         </w:rPr>
+        <w:t>Matrix for one delivery date</w:t>
+      </w:r>
+    </w:p>
+    <w:p>
+      <w:pPr>
+        <w:spacing w:after="40"/>
+        <w:ind w:left="510" w:hanging="312"/>
+      </w:pPr>
+      <w:r>
+        <w:t xml:space="preserve">•  </w:t>
+      </w:r>
+      <w:r>
+        <w:rPr>
+          <w:b/>
+          <w:i w:val="0"/>
+        </w:rPr>
+        <w:t>Show Stock</w:t>
+      </w:r>
+      <w:r>
+        <w:rPr>
+          <w:b w:val="0"/>
+          <w:i w:val="0"/>
+        </w:rPr>
+        <w:t xml:space="preserve"> and </w:t>
+      </w:r>
+      <w:r>
+        <w:rPr>
+          <w:b/>
+          <w:i w:val="0"/>
+        </w:rPr>
+        <w:t>Show To Purchase</w:t>
+      </w:r>
+      <w:r>
+        <w:rPr>
+          <w:b w:val="0"/>
+          <w:i w:val="0"/>
+        </w:rPr>
+        <w:t xml:space="preserve"> switch those columns; </w:t>
+      </w:r>
+      <w:r>
+        <w:rPr>
+          <w:b/>
+          <w:i w:val="0"/>
+        </w:rPr>
+        <w:t>Export to Excel</w:t>
+      </w:r>
+      <w:r>
+        <w:rPr>
+          <w:b w:val="0"/>
+          <w:i w:val="0"/>
+        </w:rPr>
+        <w:t xml:space="preserve"> and </w:t>
+      </w:r>
+      <w:r>
+        <w:rPr>
+          <w:b/>
+          <w:i w:val="0"/>
+        </w:rPr>
+        <w:t>Print Configuration</w:t>
+      </w:r>
+      <w:r>
+        <w:rPr>
+          <w:b w:val="0"/>
+          <w:i w:val="0"/>
+        </w:rPr>
+        <w:t xml:space="preserve"> produce a copy.</w:t>
+      </w:r>
+    </w:p>
+    <w:p>
+      <w:r>
+        <w:rPr>
+          <w:b/>
+        </w:rPr>
+        <w:t xml:space="preserve">See also: </w:t>
+      </w:r>
+      <w:hyperlink w:anchor="orders-list">
+        <w:r>
+          <w:rPr>
+            <w:color w:val="4F46E5"/>
+            <w:u w:val="single"/>
+          </w:rPr>
+          <w:t xml:space="preserve">Orders and shipments</w:t>
+        </w:r>
+      </w:hyperlink>
+      <w:r>
+        <w:t xml:space="preserve">  ·  </w:t>
+      </w:r>
+      <w:hyperlink w:anchor="inventory">
+        <w:r>
+          <w:rPr>
+            <w:color w:val="4F46E5"/>
+            <w:u w:val="single"/>
+          </w:rPr>
+          <w:t xml:space="preserve">Inventory: live stock</w:t>
+        </w:r>
+      </w:hyperlink>
+    </w:p>
+    <w:p>
+      <w:r>
+        <w:br w:type="page"/>
+      </w:r>
+    </w:p>
+    <w:p>
+      <w:bookmarkStart w:id="132" w:name="chapter-masters"/>
+      <w:pPr>
+        <w:pStyle w:val="Heading1"/>
+      </w:pPr>
+      <w:r>
+        <w:t>Chapter 5. Masters: items, customers, suppliers</w:t>
+      </w:r>
+      <w:bookmarkEnd w:id="132"/>
+    </w:p>
+    <w:p>
+      <w:bookmarkStart w:id="133" w:name="items"/>
+      <w:pPr>
+        <w:pStyle w:val="Heading2"/>
+      </w:pPr>
+      <w:r>
+        <w:t>5.1  Items</w:t>
+      </w:r>
+      <w:bookmarkEnd w:id="133"/>
+    </w:p>
+    <w:p>
+      <w:r>
+        <w:rPr>
+          <w:i/>
+          <w:color w:val="64748B"/>
+          <w:sz w:val="18"/>
+        </w:rPr>
+        <w:t>Screen: Item Master</w:t>
+      </w:r>
+    </w:p>
+    <w:p>
+      <w:r>
+        <w:rPr>
+          <w:b/>
+          <w:i w:val="0"/>
+        </w:rPr>
+        <w:t>Masters → Item Master</w:t>
+      </w:r>
+      <w:r>
+        <w:rPr>
+          <w:b w:val="0"/>
+          <w:i w:val="0"/>
+        </w:rPr>
+        <w:t xml:space="preserve"> (</w:t>
+      </w:r>
+      <w:r>
+        <w:rPr>
+          <w:b/>
+          <w:i w:val="0"/>
+        </w:rPr>
+        <w:t>F10</w:t>
+      </w:r>
+      <w:r>
+        <w:rPr>
+          <w:b w:val="0"/>
+          <w:i w:val="0"/>
+        </w:rPr>
+        <w:t>).</w:t>
+      </w:r>
+    </w:p>
+    <w:p>
+      <w:pPr>
+        <w:jc w:val="center"/>
+      </w:pPr>
+      <w:r>
+        <w:drawing>
+          <wp:inline xmlns:a="http://schemas.openxmlformats.org/drawingml/2006/main" xmlns:pic="http://schemas.openxmlformats.org/drawingml/2006/picture">
+            <wp:extent cx="6120000" cy="3902609"/>
+            <wp:docPr id="34" name="Picture 34"/>
+            <wp:cNvGraphicFramePr>
+              <a:graphicFrameLocks noChangeAspect="1"/>
+            </wp:cNvGraphicFramePr>
+            <a:graphic>
+              <a:graphicData uri="http://schemas.openxmlformats.org/drawingml/2006/picture">
+                <pic:pic>
+                  <pic:nvPicPr>
+                    <pic:cNvPr id="0" name="50-items.png"/>
+                    <pic:cNvPicPr/>
+                  </pic:nvPicPr>
+                  <pic:blipFill>
+                    <a:blip r:embed="rId41"/>
+                    <a:stretch>
+                      <a:fillRect/>
+                    </a:stretch>
+                  </pic:blipFill>
+                  <pic:spPr>
+                    <a:xfrm>
+                      <a:off x="0" y="0"/>
+                      <a:ext cx="6120000" cy="3902609"/>
+                    </a:xfrm>
+                    <a:prstGeom prst="rect"/>
+                  </pic:spPr>
+                </pic:pic>
+              </a:graphicData>
+            </a:graphic>
+          </wp:inline>
+        </w:drawing>
+      </w:r>
+    </w:p>
+    <w:p>
+      <w:pPr>
+        <w:jc w:val="center"/>
+      </w:pPr>
+      <w:r>
+        <w:rPr>
+          <w:i/>
+          <w:color w:val="64748B"/>
+          <w:sz w:val="18"/>
+        </w:rPr>
         <w:t>Item Master</w:t>
       </w:r>
     </w:p>
@@ -13886,7 +13886,7 @@
                     <pic:cNvPicPr/>
                   </pic:nvPicPr>
                   <pic:blipFill>
-                    <a:blip r:embed="rId41"/>
+                    <a:blip r:embed="rId42"/>
                     <a:stretch>
                       <a:fillRect/>
                     </a:stretch>
@@ -14252,7 +14252,7 @@
                     <pic:cNvPicPr/>
                   </pic:nvPicPr>
                   <pic:blipFill>
-                    <a:blip r:embed="rId42"/>
+                    <a:blip r:embed="rId43"/>
                     <a:stretch>
                       <a:fillRect/>
                     </a:stretch>
@@ -14443,7 +14443,7 @@
                     <pic:cNvPicPr/>
                   </pic:nvPicPr>
                   <pic:blipFill>
-                    <a:blip r:embed="rId43"/>
+                    <a:blip r:embed="rId44"/>
                     <a:stretch>
                       <a:fillRect/>
                     </a:stretch>
@@ -14662,7 +14662,7 @@
                     <pic:cNvPicPr/>
                   </pic:nvPicPr>
                   <pic:blipFill>
-                    <a:blip r:embed="rId44"/>
+                    <a:blip r:embed="rId45"/>
                     <a:stretch>
                       <a:fillRect/>
                     </a:stretch>
@@ -14714,7 +14714,7 @@
                     <pic:cNvPicPr/>
                   </pic:nvPicPr>
                   <pic:blipFill>
-                    <a:blip r:embed="rId45"/>
+                    <a:blip r:embed="rId46"/>
                     <a:stretch>
                       <a:fillRect/>
                     </a:stretch>
@@ -14861,7 +14861,7 @@
                     <pic:cNvPicPr/>
                   </pic:nvPicPr>
                   <pic:blipFill>
-                    <a:blip r:embed="rId46"/>
+                    <a:blip r:embed="rId47"/>
                     <a:stretch>
                       <a:fillRect/>
                     </a:stretch>
@@ -15082,7 +15082,7 @@
                     <pic:cNvPicPr/>
                   </pic:nvPicPr>
                   <pic:blipFill>
-                    <a:blip r:embed="rId47"/>
+                    <a:blip r:embed="rId48"/>
                     <a:stretch>
                       <a:fillRect/>
                     </a:stretch>
@@ -15219,6 +15219,34 @@
           <w:b/>
           <w:i w:val="0"/>
         </w:rPr>
+        <w:t>Masters → Inventory &amp; Stock</w:t>
+      </w:r>
+      <w:r>
+        <w:rPr>
+          <w:b w:val="0"/>
+          <w:i w:val="0"/>
+        </w:rPr>
+        <w:t xml:space="preserve"> opens the inventory screen on </w:t>
+      </w:r>
+      <w:r>
+        <w:rPr>
+          <w:b/>
+          <w:i w:val="0"/>
+        </w:rPr>
+        <w:t>Live Stock Overview</w:t>
+      </w:r>
+      <w:r>
+        <w:rPr>
+          <w:b w:val="0"/>
+          <w:i w:val="0"/>
+        </w:rPr>
+        <w:t xml:space="preserve"> (</w:t>
+      </w:r>
+      <w:r>
+        <w:rPr>
+          <w:b/>
+          <w:i w:val="0"/>
+        </w:rPr>
         <w:t>Masters → Waste Management</w:t>
       </w:r>
       <w:r>
@@ -15226,7 +15254,7 @@
           <w:b w:val="0"/>
           <w:i w:val="0"/>
         </w:rPr>
-        <w:t xml:space="preserve"> opens the inventory screen with four tabs.</w:t>
+        <w:t xml:space="preserve"> opens the same screen on the waste tab). It has four tabs.</w:t>
       </w:r>
     </w:p>
     <w:p>
@@ -15246,104 +15274,6 @@
                 <pic:pic>
                   <pic:nvPicPr>
                     <pic:cNvPr id="0" name="60-inventory.png"/>
-                    <pic:cNvPicPr/>
-                  </pic:nvPicPr>
-                  <pic:blipFill>
-                    <a:blip r:embed="rId48"/>
-                    <a:stretch>
-                      <a:fillRect/>
-                    </a:stretch>
-                  </pic:blipFill>
-                  <pic:spPr>
-                    <a:xfrm>
-                      <a:off x="0" y="0"/>
-                      <a:ext cx="6120000" cy="3902609"/>
-                    </a:xfrm>
-                    <a:prstGeom prst="rect"/>
-                  </pic:spPr>
-                </pic:pic>
-              </a:graphicData>
-            </a:graphic>
-          </wp:inline>
-        </w:drawing>
-      </w:r>
-    </w:p>
-    <w:p>
-      <w:pPr>
-        <w:jc w:val="center"/>
-      </w:pPr>
-      <w:r>
-        <w:rPr>
-          <w:i/>
-          <w:color w:val="64748B"/>
-          <w:sz w:val="18"/>
-        </w:rPr>
-        <w:t>Live stock</w:t>
-      </w:r>
-    </w:p>
-    <w:p>
-      <w:pPr>
-        <w:spacing w:after="40"/>
-        <w:ind w:left="510" w:hanging="312"/>
-      </w:pPr>
-      <w:r>
-        <w:t xml:space="preserve">•  </w:t>
-      </w:r>
-      <w:r>
-        <w:rPr>
-          <w:b/>
-          <w:i w:val="0"/>
-        </w:rPr>
-        <w:t>Live Stock Overview:</w:t>
-      </w:r>
-      <w:r>
-        <w:rPr>
-          <w:b w:val="0"/>
-          <w:i w:val="0"/>
-        </w:rPr>
-        <w:t xml:space="preserve"> every item with its quantity on hand.</w:t>
-      </w:r>
-    </w:p>
-    <w:p>
-      <w:pPr>
-        <w:spacing w:after="40"/>
-        <w:ind w:left="510" w:hanging="312"/>
-      </w:pPr>
-      <w:r>
-        <w:t xml:space="preserve">•  </w:t>
-      </w:r>
-      <w:r>
-        <w:rPr>
-          <w:b/>
-          <w:i w:val="0"/>
-        </w:rPr>
-        <w:t>Stock Movement History:</w:t>
-      </w:r>
-      <w:r>
-        <w:rPr>
-          <w:b w:val="0"/>
-          <w:i w:val="0"/>
-        </w:rPr>
-        <w:t xml:space="preserve"> every sale, return, goods receipt, adjustment and waste that changed stock, with date and reference.</w:t>
-      </w:r>
-    </w:p>
-    <w:p>
-      <w:pPr>
-        <w:jc w:val="center"/>
-      </w:pPr>
-      <w:r>
-        <w:drawing>
-          <wp:inline xmlns:a="http://schemas.openxmlformats.org/drawingml/2006/main" xmlns:pic="http://schemas.openxmlformats.org/drawingml/2006/picture">
-            <wp:extent cx="6120000" cy="3902609"/>
-            <wp:docPr id="43" name="Picture 43"/>
-            <wp:cNvGraphicFramePr>
-              <a:graphicFrameLocks noChangeAspect="1"/>
-            </wp:cNvGraphicFramePr>
-            <a:graphic>
-              <a:graphicData uri="http://schemas.openxmlformats.org/drawingml/2006/picture">
-                <pic:pic>
-                  <pic:nvPicPr>
-                    <pic:cNvPr id="0" name="62-stock-movements.png"/>
                     <pic:cNvPicPr/>
                   </pic:nvPicPr>
                   <pic:blipFill>
@@ -15376,6 +15306,104 @@
           <w:color w:val="64748B"/>
           <w:sz w:val="18"/>
         </w:rPr>
+        <w:t>Live stock</w:t>
+      </w:r>
+    </w:p>
+    <w:p>
+      <w:pPr>
+        <w:spacing w:after="40"/>
+        <w:ind w:left="510" w:hanging="312"/>
+      </w:pPr>
+      <w:r>
+        <w:t xml:space="preserve">•  </w:t>
+      </w:r>
+      <w:r>
+        <w:rPr>
+          <w:b/>
+          <w:i w:val="0"/>
+        </w:rPr>
+        <w:t>Live Stock Overview:</w:t>
+      </w:r>
+      <w:r>
+        <w:rPr>
+          <w:b w:val="0"/>
+          <w:i w:val="0"/>
+        </w:rPr>
+        <w:t xml:space="preserve"> every item with its quantity on hand.</w:t>
+      </w:r>
+    </w:p>
+    <w:p>
+      <w:pPr>
+        <w:spacing w:after="40"/>
+        <w:ind w:left="510" w:hanging="312"/>
+      </w:pPr>
+      <w:r>
+        <w:t xml:space="preserve">•  </w:t>
+      </w:r>
+      <w:r>
+        <w:rPr>
+          <w:b/>
+          <w:i w:val="0"/>
+        </w:rPr>
+        <w:t>Stock Movement History:</w:t>
+      </w:r>
+      <w:r>
+        <w:rPr>
+          <w:b w:val="0"/>
+          <w:i w:val="0"/>
+        </w:rPr>
+        <w:t xml:space="preserve"> every sale, return, goods receipt, adjustment and waste that changed stock, with date and reference.</w:t>
+      </w:r>
+    </w:p>
+    <w:p>
+      <w:pPr>
+        <w:jc w:val="center"/>
+      </w:pPr>
+      <w:r>
+        <w:drawing>
+          <wp:inline xmlns:a="http://schemas.openxmlformats.org/drawingml/2006/main" xmlns:pic="http://schemas.openxmlformats.org/drawingml/2006/picture">
+            <wp:extent cx="6120000" cy="3902609"/>
+            <wp:docPr id="43" name="Picture 43"/>
+            <wp:cNvGraphicFramePr>
+              <a:graphicFrameLocks noChangeAspect="1"/>
+            </wp:cNvGraphicFramePr>
+            <a:graphic>
+              <a:graphicData uri="http://schemas.openxmlformats.org/drawingml/2006/picture">
+                <pic:pic>
+                  <pic:nvPicPr>
+                    <pic:cNvPr id="0" name="62-stock-movements.png"/>
+                    <pic:cNvPicPr/>
+                  </pic:nvPicPr>
+                  <pic:blipFill>
+                    <a:blip r:embed="rId50"/>
+                    <a:stretch>
+                      <a:fillRect/>
+                    </a:stretch>
+                  </pic:blipFill>
+                  <pic:spPr>
+                    <a:xfrm>
+                      <a:off x="0" y="0"/>
+                      <a:ext cx="6120000" cy="3902609"/>
+                    </a:xfrm>
+                    <a:prstGeom prst="rect"/>
+                  </pic:spPr>
+                </pic:pic>
+              </a:graphicData>
+            </a:graphic>
+          </wp:inline>
+        </w:drawing>
+      </w:r>
+    </w:p>
+    <w:p>
+      <w:pPr>
+        <w:jc w:val="center"/>
+      </w:pPr>
+      <w:r>
+        <w:rPr>
+          <w:i/>
+          <w:color w:val="64748B"/>
+          <w:sz w:val="18"/>
+        </w:rPr>
         <w:t>Stock movements</w:t>
       </w:r>
     </w:p>
@@ -15665,7 +15693,7 @@
                     <pic:cNvPicPr/>
                   </pic:nvPicPr>
                   <pic:blipFill>
-                    <a:blip r:embed="rId50"/>
+                    <a:blip r:embed="rId51"/>
                     <a:stretch>
                       <a:fillRect/>
                     </a:stretch>
@@ -15953,7 +15981,7 @@
                     <pic:cNvPicPr/>
                   </pic:nvPicPr>
                   <pic:blipFill>
-                    <a:blip r:embed="rId51"/>
+                    <a:blip r:embed="rId52"/>
                     <a:stretch>
                       <a:fillRect/>
                     </a:stretch>
@@ -16025,195 +16053,6 @@
                 <pic:pic>
                   <pic:nvPicPr>
                     <pic:cNvPr id="0" name="64-waste-logs.png"/>
-                    <pic:cNvPicPr/>
-                  </pic:nvPicPr>
-                  <pic:blipFill>
-                    <a:blip r:embed="rId52"/>
-                    <a:stretch>
-                      <a:fillRect/>
-                    </a:stretch>
-                  </pic:blipFill>
-                  <pic:spPr>
-                    <a:xfrm>
-                      <a:off x="0" y="0"/>
-                      <a:ext cx="6120000" cy="3902609"/>
-                    </a:xfrm>
-                    <a:prstGeom prst="rect"/>
-                  </pic:spPr>
-                </pic:pic>
-              </a:graphicData>
-            </a:graphic>
-          </wp:inline>
-        </w:drawing>
-      </w:r>
-    </w:p>
-    <w:p>
-      <w:pPr>
-        <w:jc w:val="center"/>
-      </w:pPr>
-      <w:r>
-        <w:rPr>
-          <w:i/>
-          <w:color w:val="64748B"/>
-          <w:sz w:val="18"/>
-        </w:rPr>
-        <w:t>Waste logs</w:t>
-      </w:r>
-    </w:p>
-    <w:p>
-      <w:r>
-        <w:rPr>
-          <w:b w:val="0"/>
-          <w:i w:val="0"/>
-        </w:rPr>
-        <w:t xml:space="preserve">If the stock is tracked you cannot waste more than is on hand. Goods a </w:t>
-      </w:r>
-      <w:r>
-        <w:rPr>
-          <w:b/>
-          <w:i w:val="0"/>
-        </w:rPr>
-        <w:t>customer</w:t>
-      </w:r>
-      <w:r>
-        <w:rPr>
-          <w:b w:val="0"/>
-          <w:i w:val="0"/>
-        </w:rPr>
-        <w:t xml:space="preserve"> returns as spoiled are handled by </w:t>
-      </w:r>
-      <w:hyperlink w:anchor="return-goods">
-        <w:r>
-          <w:rPr>
-            <w:color w:val="4F46E5"/>
-            <w:u w:val="single"/>
-          </w:rPr>
-          <w:t xml:space="preserve">Return goods</w:t>
-        </w:r>
-      </w:hyperlink>
-      <w:r>
-        <w:rPr>
-          <w:b w:val="0"/>
-          <w:i w:val="0"/>
-        </w:rPr>
-        <w:t>, not here.</w:t>
-      </w:r>
-    </w:p>
-    <w:p>
-      <w:r>
-        <w:rPr>
-          <w:b/>
-        </w:rPr>
-        <w:t xml:space="preserve">See also: </w:t>
-      </w:r>
-      <w:hyperlink w:anchor="stock-adjust">
-        <w:r>
-          <w:rPr>
-            <w:color w:val="4F46E5"/>
-            <w:u w:val="single"/>
-          </w:rPr>
-          <w:t xml:space="preserve">Stock adjustment (after counting)</w:t>
-        </w:r>
-      </w:hyperlink>
-      <w:r>
-        <w:t xml:space="preserve">  ·  </w:t>
-      </w:r>
-      <w:hyperlink w:anchor="return-goods">
-        <w:r>
-          <w:rPr>
-            <w:color w:val="4F46E5"/>
-            <w:u w:val="single"/>
-          </w:rPr>
-          <w:t xml:space="preserve">Return goods (credit note)</w:t>
-        </w:r>
-      </w:hyperlink>
-      <w:r>
-        <w:t xml:space="preserve">  ·  </w:t>
-      </w:r>
-      <w:hyperlink w:anchor="inventory">
-        <w:r>
-          <w:rPr>
-            <w:color w:val="4F46E5"/>
-            <w:u w:val="single"/>
-          </w:rPr>
-          <w:t xml:space="preserve">Inventory: live stock</w:t>
-        </w:r>
-      </w:hyperlink>
-    </w:p>
-    <w:p>
-      <w:bookmarkStart w:id="141" w:name="crates"/>
-      <w:pPr>
-        <w:pStyle w:val="Heading2"/>
-      </w:pPr>
-      <w:r>
-        <w:t>6.4  Crates</w:t>
-      </w:r>
-      <w:bookmarkEnd w:id="141"/>
-    </w:p>
-    <w:p>
-      <w:r>
-        <w:rPr>
-          <w:i/>
-          <w:color w:val="64748B"/>
-          <w:sz w:val="18"/>
-        </w:rPr>
-        <w:t>Screen: Inventory</w:t>
-      </w:r>
-    </w:p>
-    <w:p>
-      <w:r>
-        <w:rPr>
-          <w:b w:val="0"/>
-          <w:i w:val="0"/>
-        </w:rPr>
-        <w:t>Returnable crates that go out with a bill or an order (</w:t>
-      </w:r>
-      <w:r>
-        <w:rPr>
-          <w:b/>
-          <w:i w:val="0"/>
-        </w:rPr>
-        <w:t>Crates out</w:t>
-      </w:r>
-      <w:r>
-        <w:rPr>
-          <w:b w:val="0"/>
-          <w:i w:val="0"/>
-        </w:rPr>
-        <w:t>) and come back (</w:t>
-      </w:r>
-      <w:r>
-        <w:rPr>
-          <w:b/>
-          <w:i w:val="0"/>
-        </w:rPr>
-        <w:t>Crates in</w:t>
-      </w:r>
-      <w:r>
-        <w:rPr>
-          <w:b w:val="0"/>
-          <w:i w:val="0"/>
-        </w:rPr>
-        <w:t>) are tracked per customer.</w:t>
-      </w:r>
-    </w:p>
-    <w:p>
-      <w:pPr>
-        <w:jc w:val="center"/>
-      </w:pPr>
-      <w:r>
-        <w:drawing>
-          <wp:inline xmlns:a="http://schemas.openxmlformats.org/drawingml/2006/main" xmlns:pic="http://schemas.openxmlformats.org/drawingml/2006/picture">
-            <wp:extent cx="6120000" cy="3902609"/>
-            <wp:docPr id="47" name="Picture 47"/>
-            <wp:cNvGraphicFramePr>
-              <a:graphicFrameLocks noChangeAspect="1"/>
-            </wp:cNvGraphicFramePr>
-            <a:graphic>
-              <a:graphicData uri="http://schemas.openxmlformats.org/drawingml/2006/picture">
-                <pic:pic>
-                  <pic:nvPicPr>
-                    <pic:cNvPr id="0" name="65-crates.png"/>
                     <pic:cNvPicPr/>
                   </pic:nvPicPr>
                   <pic:blipFill>
@@ -16246,37 +16085,79 @@
           <w:color w:val="64748B"/>
           <w:sz w:val="18"/>
         </w:rPr>
-        <w:t>Crate balances</w:t>
-      </w:r>
-    </w:p>
-    <w:p>
-      <w:r>
-        <w:rPr>
-          <w:b w:val="0"/>
-          <w:i w:val="0"/>
-        </w:rPr>
-        <w:t>Voiding a bill reverses its crates. Crate numbers must be whole numbers, 0 or more.</w:t>
-      </w:r>
-    </w:p>
-    <w:p>
+        <w:t>Waste logs</w:t>
+      </w:r>
+    </w:p>
+    <w:p>
+      <w:r>
+        <w:rPr>
+          <w:b w:val="0"/>
+          <w:i w:val="0"/>
+        </w:rPr>
+        <w:t xml:space="preserve">If the stock is tracked you cannot waste more than is on hand. Goods a </w:t>
+      </w:r>
       <w:r>
         <w:rPr>
           <w:b/>
+          <w:i w:val="0"/>
+        </w:rPr>
+        <w:t>customer</w:t>
+      </w:r>
+      <w:r>
+        <w:rPr>
+          <w:b w:val="0"/>
+          <w:i w:val="0"/>
+        </w:rPr>
+        <w:t xml:space="preserve"> returns as spoiled are handled by </w:t>
+      </w:r>
+      <w:hyperlink w:anchor="return-goods">
+        <w:r>
+          <w:rPr>
+            <w:color w:val="4F46E5"/>
+            <w:u w:val="single"/>
+          </w:rPr>
+          <w:t xml:space="preserve">Return goods</w:t>
+        </w:r>
+      </w:hyperlink>
+      <w:r>
+        <w:rPr>
+          <w:b w:val="0"/>
+          <w:i w:val="0"/>
+        </w:rPr>
+        <w:t>, not here.</w:t>
+      </w:r>
+    </w:p>
+    <w:p>
+      <w:r>
+        <w:rPr>
+          <w:b/>
         </w:rPr>
         <w:t xml:space="preserve">See also: </w:t>
       </w:r>
-      <w:hyperlink w:anchor="order-new">
-        <w:r>
-          <w:rPr>
-            <w:color w:val="4F46E5"/>
-            <w:u w:val="single"/>
-          </w:rPr>
-          <w:t xml:space="preserve">New customer order</w:t>
+      <w:hyperlink w:anchor="stock-adjust">
+        <w:r>
+          <w:rPr>
+            <w:color w:val="4F46E5"/>
+            <w:u w:val="single"/>
+          </w:rPr>
+          <w:t xml:space="preserve">Stock adjustment (after counting)</w:t>
         </w:r>
       </w:hyperlink>
       <w:r>
         <w:t xml:space="preserve">  ·  </w:t>
       </w:r>
+      <w:hyperlink w:anchor="return-goods">
+        <w:r>
+          <w:rPr>
+            <w:color w:val="4F46E5"/>
+            <w:u w:val="single"/>
+          </w:rPr>
+          <w:t xml:space="preserve">Return goods (credit note)</w:t>
+        </w:r>
+      </w:hyperlink>
+      <w:r>
+        <w:t xml:space="preserve">  ·  </w:t>
+      </w:r>
       <w:hyperlink w:anchor="inventory">
         <w:r>
           <w:rPr>
@@ -16288,14 +16169,14 @@
       </w:hyperlink>
     </w:p>
     <w:p>
-      <w:bookmarkStart w:id="142" w:name="procurement-bills"/>
+      <w:bookmarkStart w:id="141" w:name="crates"/>
       <w:pPr>
         <w:pStyle w:val="Heading2"/>
       </w:pPr>
       <w:r>
-        <w:t>6.5  Procurement and vendor bills</w:t>
-      </w:r>
-      <w:bookmarkEnd w:id="142"/>
+        <w:t>6.4  Crates</w:t>
+      </w:r>
+      <w:bookmarkEnd w:id="141"/>
     </w:p>
     <w:p>
       <w:r>
@@ -16304,37 +16185,44 @@
           <w:color w:val="64748B"/>
           <w:sz w:val="18"/>
         </w:rPr>
-        <w:t>Screen: Procurement</w:t>
-      </w:r>
-    </w:p>
-    <w:p>
+        <w:t>Screen: Inventory</w:t>
+      </w:r>
+    </w:p>
+    <w:p>
+      <w:r>
+        <w:rPr>
+          <w:b w:val="0"/>
+          <w:i w:val="0"/>
+        </w:rPr>
+        <w:t>Returnable crates that go out with a bill or an order (</w:t>
+      </w:r>
       <w:r>
         <w:rPr>
           <w:b/>
           <w:i w:val="0"/>
         </w:rPr>
-        <w:t>File → Purchase system</w:t>
-      </w:r>
-      <w:r>
-        <w:rPr>
-          <w:b w:val="0"/>
-          <w:i w:val="0"/>
-        </w:rPr>
-        <w:t xml:space="preserve"> or </w:t>
+        <w:t>Crates out</w:t>
+      </w:r>
+      <w:r>
+        <w:rPr>
+          <w:b w:val="0"/>
+          <w:i w:val="0"/>
+        </w:rPr>
+        <w:t>) and come back (</w:t>
       </w:r>
       <w:r>
         <w:rPr>
           <w:b/>
           <w:i w:val="0"/>
         </w:rPr>
-        <w:t>Ctrl+P</w:t>
-      </w:r>
-      <w:r>
-        <w:rPr>
-          <w:b w:val="0"/>
-          <w:i w:val="0"/>
-        </w:rPr>
-        <w:t>.</w:t>
+        <w:t>Crates in</w:t>
+      </w:r>
+      <w:r>
+        <w:rPr>
+          <w:b w:val="0"/>
+          <w:i w:val="0"/>
+        </w:rPr>
+        <w:t>) are tracked per customer.</w:t>
       </w:r>
     </w:p>
     <w:p>
@@ -16345,7 +16233,7 @@
         <w:drawing>
           <wp:inline xmlns:a="http://schemas.openxmlformats.org/drawingml/2006/main" xmlns:pic="http://schemas.openxmlformats.org/drawingml/2006/picture">
             <wp:extent cx="6120000" cy="3902609"/>
-            <wp:docPr id="48" name="Picture 48"/>
+            <wp:docPr id="47" name="Picture 47"/>
             <wp:cNvGraphicFramePr>
               <a:graphicFrameLocks noChangeAspect="1"/>
             </wp:cNvGraphicFramePr>
@@ -16353,7 +16241,7 @@
               <a:graphicData uri="http://schemas.openxmlformats.org/drawingml/2006/picture">
                 <pic:pic>
                   <pic:nvPicPr>
-                    <pic:cNvPr id="0" name="66-vendor-bills.png"/>
+                    <pic:cNvPr id="0" name="65-crates.png"/>
                     <pic:cNvPicPr/>
                   </pic:nvPicPr>
                   <pic:blipFill>
@@ -16386,6 +16274,146 @@
           <w:color w:val="64748B"/>
           <w:sz w:val="18"/>
         </w:rPr>
+        <w:t>Crate balances</w:t>
+      </w:r>
+    </w:p>
+    <w:p>
+      <w:r>
+        <w:rPr>
+          <w:b w:val="0"/>
+          <w:i w:val="0"/>
+        </w:rPr>
+        <w:t>Voiding a bill reverses its crates. Crate numbers must be whole numbers, 0 or more.</w:t>
+      </w:r>
+    </w:p>
+    <w:p>
+      <w:r>
+        <w:rPr>
+          <w:b/>
+        </w:rPr>
+        <w:t xml:space="preserve">See also: </w:t>
+      </w:r>
+      <w:hyperlink w:anchor="order-new">
+        <w:r>
+          <w:rPr>
+            <w:color w:val="4F46E5"/>
+            <w:u w:val="single"/>
+          </w:rPr>
+          <w:t xml:space="preserve">New customer order</w:t>
+        </w:r>
+      </w:hyperlink>
+      <w:r>
+        <w:t xml:space="preserve">  ·  </w:t>
+      </w:r>
+      <w:hyperlink w:anchor="inventory">
+        <w:r>
+          <w:rPr>
+            <w:color w:val="4F46E5"/>
+            <w:u w:val="single"/>
+          </w:rPr>
+          <w:t xml:space="preserve">Inventory: live stock</w:t>
+        </w:r>
+      </w:hyperlink>
+    </w:p>
+    <w:p>
+      <w:bookmarkStart w:id="142" w:name="procurement-bills"/>
+      <w:pPr>
+        <w:pStyle w:val="Heading2"/>
+      </w:pPr>
+      <w:r>
+        <w:t>6.5  Procurement and vendor bills</w:t>
+      </w:r>
+      <w:bookmarkEnd w:id="142"/>
+    </w:p>
+    <w:p>
+      <w:r>
+        <w:rPr>
+          <w:i/>
+          <w:color w:val="64748B"/>
+          <w:sz w:val="18"/>
+        </w:rPr>
+        <w:t>Screen: Procurement</w:t>
+      </w:r>
+    </w:p>
+    <w:p>
+      <w:r>
+        <w:rPr>
+          <w:b/>
+          <w:i w:val="0"/>
+        </w:rPr>
+        <w:t>File → Purchase system</w:t>
+      </w:r>
+      <w:r>
+        <w:rPr>
+          <w:b w:val="0"/>
+          <w:i w:val="0"/>
+        </w:rPr>
+        <w:t xml:space="preserve"> or </w:t>
+      </w:r>
+      <w:r>
+        <w:rPr>
+          <w:b/>
+          <w:i w:val="0"/>
+        </w:rPr>
+        <w:t>Ctrl+P</w:t>
+      </w:r>
+      <w:r>
+        <w:rPr>
+          <w:b w:val="0"/>
+          <w:i w:val="0"/>
+        </w:rPr>
+        <w:t>.</w:t>
+      </w:r>
+    </w:p>
+    <w:p>
+      <w:pPr>
+        <w:jc w:val="center"/>
+      </w:pPr>
+      <w:r>
+        <w:drawing>
+          <wp:inline xmlns:a="http://schemas.openxmlformats.org/drawingml/2006/main" xmlns:pic="http://schemas.openxmlformats.org/drawingml/2006/picture">
+            <wp:extent cx="6120000" cy="3902609"/>
+            <wp:docPr id="48" name="Picture 48"/>
+            <wp:cNvGraphicFramePr>
+              <a:graphicFrameLocks noChangeAspect="1"/>
+            </wp:cNvGraphicFramePr>
+            <a:graphic>
+              <a:graphicData uri="http://schemas.openxmlformats.org/drawingml/2006/picture">
+                <pic:pic>
+                  <pic:nvPicPr>
+                    <pic:cNvPr id="0" name="66-vendor-bills.png"/>
+                    <pic:cNvPicPr/>
+                  </pic:nvPicPr>
+                  <pic:blipFill>
+                    <a:blip r:embed="rId55"/>
+                    <a:stretch>
+                      <a:fillRect/>
+                    </a:stretch>
+                  </pic:blipFill>
+                  <pic:spPr>
+                    <a:xfrm>
+                      <a:off x="0" y="0"/>
+                      <a:ext cx="6120000" cy="3902609"/>
+                    </a:xfrm>
+                    <a:prstGeom prst="rect"/>
+                  </pic:spPr>
+                </pic:pic>
+              </a:graphicData>
+            </a:graphic>
+          </wp:inline>
+        </w:drawing>
+      </w:r>
+    </w:p>
+    <w:p>
+      <w:pPr>
+        <w:jc w:val="center"/>
+      </w:pPr>
+      <w:r>
+        <w:rPr>
+          <w:i/>
+          <w:color w:val="64748B"/>
+          <w:sz w:val="18"/>
+        </w:rPr>
         <w:t>Vendor purchase bills</w:t>
       </w:r>
     </w:p>
@@ -16674,7 +16702,7 @@
                     <pic:cNvPicPr/>
                   </pic:nvPicPr>
                   <pic:blipFill>
-                    <a:blip r:embed="rId55"/>
+                    <a:blip r:embed="rId56"/>
                     <a:stretch>
                       <a:fillRect/>
                     </a:stretch>
@@ -16869,81 +16897,6 @@
                 <pic:pic>
                   <pic:nvPicPr>
                     <pic:cNvPr id="0" name="68-purchase-orders.png"/>
-                    <pic:cNvPicPr/>
-                  </pic:nvPicPr>
-                  <pic:blipFill>
-                    <a:blip r:embed="rId56"/>
-                    <a:stretch>
-                      <a:fillRect/>
-                    </a:stretch>
-                  </pic:blipFill>
-                  <pic:spPr>
-                    <a:xfrm>
-                      <a:off x="0" y="0"/>
-                      <a:ext cx="6120000" cy="3902609"/>
-                    </a:xfrm>
-                    <a:prstGeom prst="rect"/>
-                  </pic:spPr>
-                </pic:pic>
-              </a:graphicData>
-            </a:graphic>
-          </wp:inline>
-        </w:drawing>
-      </w:r>
-    </w:p>
-    <w:p>
-      <w:pPr>
-        <w:jc w:val="center"/>
-      </w:pPr>
-      <w:r>
-        <w:rPr>
-          <w:i/>
-          <w:color w:val="64748B"/>
-          <w:sz w:val="18"/>
-        </w:rPr>
-        <w:t>Purchase orders</w:t>
-      </w:r>
-    </w:p>
-    <w:p>
-      <w:pPr>
-        <w:spacing w:after="40"/>
-        <w:ind w:left="510" w:hanging="312"/>
-      </w:pPr>
-      <w:r>
-        <w:t xml:space="preserve">•  </w:t>
-      </w:r>
-      <w:r>
-        <w:rPr>
-          <w:b/>
-          <w:i w:val="0"/>
-        </w:rPr>
-        <w:t>Goods Receipt Notes (GRN):</w:t>
-      </w:r>
-      <w:r>
-        <w:rPr>
-          <w:b w:val="0"/>
-          <w:i w:val="0"/>
-        </w:rPr>
-        <w:t xml:space="preserve"> what actually arrived against a PO; receiving adds to stock.</w:t>
-      </w:r>
-    </w:p>
-    <w:p>
-      <w:pPr>
-        <w:jc w:val="center"/>
-      </w:pPr>
-      <w:r>
-        <w:drawing>
-          <wp:inline xmlns:a="http://schemas.openxmlformats.org/drawingml/2006/main" xmlns:pic="http://schemas.openxmlformats.org/drawingml/2006/picture">
-            <wp:extent cx="6120000" cy="3902609"/>
-            <wp:docPr id="51" name="Picture 51"/>
-            <wp:cNvGraphicFramePr>
-              <a:graphicFrameLocks noChangeAspect="1"/>
-            </wp:cNvGraphicFramePr>
-            <a:graphic>
-              <a:graphicData uri="http://schemas.openxmlformats.org/drawingml/2006/picture">
-                <pic:pic>
-                  <pic:nvPicPr>
-                    <pic:cNvPr id="0" name="69-goods-receipts.png"/>
                     <pic:cNvPicPr/>
                   </pic:nvPicPr>
                   <pic:blipFill>
@@ -16976,6 +16929,81 @@
           <w:color w:val="64748B"/>
           <w:sz w:val="18"/>
         </w:rPr>
+        <w:t>Purchase orders</w:t>
+      </w:r>
+    </w:p>
+    <w:p>
+      <w:pPr>
+        <w:spacing w:after="40"/>
+        <w:ind w:left="510" w:hanging="312"/>
+      </w:pPr>
+      <w:r>
+        <w:t xml:space="preserve">•  </w:t>
+      </w:r>
+      <w:r>
+        <w:rPr>
+          <w:b/>
+          <w:i w:val="0"/>
+        </w:rPr>
+        <w:t>Goods Receipt Notes (GRN):</w:t>
+      </w:r>
+      <w:r>
+        <w:rPr>
+          <w:b w:val="0"/>
+          <w:i w:val="0"/>
+        </w:rPr>
+        <w:t xml:space="preserve"> what actually arrived against a PO; receiving adds to stock.</w:t>
+      </w:r>
+    </w:p>
+    <w:p>
+      <w:pPr>
+        <w:jc w:val="center"/>
+      </w:pPr>
+      <w:r>
+        <w:drawing>
+          <wp:inline xmlns:a="http://schemas.openxmlformats.org/drawingml/2006/main" xmlns:pic="http://schemas.openxmlformats.org/drawingml/2006/picture">
+            <wp:extent cx="6120000" cy="3902609"/>
+            <wp:docPr id="51" name="Picture 51"/>
+            <wp:cNvGraphicFramePr>
+              <a:graphicFrameLocks noChangeAspect="1"/>
+            </wp:cNvGraphicFramePr>
+            <a:graphic>
+              <a:graphicData uri="http://schemas.openxmlformats.org/drawingml/2006/picture">
+                <pic:pic>
+                  <pic:nvPicPr>
+                    <pic:cNvPr id="0" name="69-goods-receipts.png"/>
+                    <pic:cNvPicPr/>
+                  </pic:nvPicPr>
+                  <pic:blipFill>
+                    <a:blip r:embed="rId58"/>
+                    <a:stretch>
+                      <a:fillRect/>
+                    </a:stretch>
+                  </pic:blipFill>
+                  <pic:spPr>
+                    <a:xfrm>
+                      <a:off x="0" y="0"/>
+                      <a:ext cx="6120000" cy="3902609"/>
+                    </a:xfrm>
+                    <a:prstGeom prst="rect"/>
+                  </pic:spPr>
+                </pic:pic>
+              </a:graphicData>
+            </a:graphic>
+          </wp:inline>
+        </w:drawing>
+      </w:r>
+    </w:p>
+    <w:p>
+      <w:pPr>
+        <w:jc w:val="center"/>
+      </w:pPr>
+      <w:r>
+        <w:rPr>
+          <w:i/>
+          <w:color w:val="64748B"/>
+          <w:sz w:val="18"/>
+        </w:rPr>
         <w:t>Goods receipts</w:t>
       </w:r>
     </w:p>
@@ -17154,7 +17182,7 @@
                     <pic:cNvPicPr/>
                   </pic:nvPicPr>
                   <pic:blipFill>
-                    <a:blip r:embed="rId58"/>
+                    <a:blip r:embed="rId59"/>
                     <a:stretch>
                       <a:fillRect/>
                     </a:stretch>
@@ -17354,7 +17382,7 @@
                     <pic:cNvPicPr/>
                   </pic:nvPicPr>
                   <pic:blipFill>
-                    <a:blip r:embed="rId59"/>
+                    <a:blip r:embed="rId60"/>
                     <a:stretch>
                       <a:fillRect/>
                     </a:stretch>
@@ -17406,7 +17434,7 @@
                     <pic:cNvPicPr/>
                   </pic:nvPicPr>
                   <pic:blipFill>
-                    <a:blip r:embed="rId60"/>
+                    <a:blip r:embed="rId61"/>
                     <a:stretch>
                       <a:fillRect/>
                     </a:stretch>
@@ -17561,212 +17589,6 @@
                 <pic:pic>
                   <pic:nvPicPr>
                     <pic:cNvPr id="0" name="80-accounting-home.png"/>
-                    <pic:cNvPicPr/>
-                  </pic:nvPicPr>
-                  <pic:blipFill>
-                    <a:blip r:embed="rId61"/>
-                    <a:stretch>
-                      <a:fillRect/>
-                    </a:stretch>
-                  </pic:blipFill>
-                  <pic:spPr>
-                    <a:xfrm>
-                      <a:off x="0" y="0"/>
-                      <a:ext cx="6120000" cy="3902609"/>
-                    </a:xfrm>
-                    <a:prstGeom prst="rect"/>
-                  </pic:spPr>
-                </pic:pic>
-              </a:graphicData>
-            </a:graphic>
-          </wp:inline>
-        </w:drawing>
-      </w:r>
-    </w:p>
-    <w:p>
-      <w:pPr>
-        <w:jc w:val="center"/>
-      </w:pPr>
-      <w:r>
-        <w:rPr>
-          <w:i/>
-          <w:color w:val="64748B"/>
-          <w:sz w:val="18"/>
-        </w:rPr>
-        <w:t>Accounting dashboard</w:t>
-      </w:r>
-    </w:p>
-    <w:p>
-      <w:r>
-        <w:rPr>
-          <w:b w:val="0"/>
-          <w:i w:val="0"/>
-        </w:rPr>
-        <w:t xml:space="preserve">The cards show total receivables, payables, bank balance and net profit; the quick buttons open the other tabs: </w:t>
-      </w:r>
-      <w:r>
-        <w:rPr>
-          <w:b/>
-          <w:i w:val="0"/>
-        </w:rPr>
-        <w:t>Accounts Receivable (AR)</w:t>
-      </w:r>
-      <w:r>
-        <w:rPr>
-          <w:b w:val="0"/>
-          <w:i w:val="0"/>
-        </w:rPr>
-        <w:t xml:space="preserve">, </w:t>
-      </w:r>
-      <w:r>
-        <w:rPr>
-          <w:b/>
-          <w:i w:val="0"/>
-        </w:rPr>
-        <w:t>Accounts Payable (AP)</w:t>
-      </w:r>
-      <w:r>
-        <w:rPr>
-          <w:b w:val="0"/>
-          <w:i w:val="0"/>
-        </w:rPr>
-        <w:t xml:space="preserve">, </w:t>
-      </w:r>
-      <w:r>
-        <w:rPr>
-          <w:b/>
-          <w:i w:val="0"/>
-        </w:rPr>
-        <w:t>Banking &amp; BRS</w:t>
-      </w:r>
-      <w:r>
-        <w:rPr>
-          <w:b w:val="0"/>
-          <w:i w:val="0"/>
-        </w:rPr>
-        <w:t xml:space="preserve"> and </w:t>
-      </w:r>
-      <w:r>
-        <w:rPr>
-          <w:b/>
-          <w:i w:val="0"/>
-        </w:rPr>
-        <w:t>General Ledger</w:t>
-      </w:r>
-      <w:r>
-        <w:rPr>
-          <w:b w:val="0"/>
-          <w:i w:val="0"/>
-        </w:rPr>
-        <w:t>.</w:t>
-      </w:r>
-    </w:p>
-    <w:p>
-      <w:r>
-        <w:rPr>
-          <w:b/>
-        </w:rPr>
-        <w:t xml:space="preserve">See also: </w:t>
-      </w:r>
-      <w:hyperlink w:anchor="receivables">
-        <w:r>
-          <w:rPr>
-            <w:color w:val="4F46E5"/>
-            <w:u w:val="single"/>
-          </w:rPr>
-          <w:t xml:space="preserve">Receivables: who owes you</w:t>
-        </w:r>
-      </w:hyperlink>
-      <w:r>
-        <w:t xml:space="preserve">  ·  </w:t>
-      </w:r>
-      <w:hyperlink w:anchor="payables">
-        <w:r>
-          <w:rPr>
-            <w:color w:val="4F46E5"/>
-            <w:u w:val="single"/>
-          </w:rPr>
-          <w:t xml:space="preserve">Payables and supplier payments</w:t>
-        </w:r>
-      </w:hyperlink>
-      <w:r>
-        <w:t xml:space="preserve">  ·  </w:t>
-      </w:r>
-      <w:hyperlink w:anchor="banking">
-        <w:r>
-          <w:rPr>
-            <w:color w:val="4F46E5"/>
-            <w:u w:val="single"/>
-          </w:rPr>
-          <w:t xml:space="preserve">Banking and reconciliation</w:t>
-        </w:r>
-      </w:hyperlink>
-      <w:r>
-        <w:t xml:space="preserve">  ·  </w:t>
-      </w:r>
-      <w:hyperlink w:anchor="statements">
-        <w:r>
-          <w:rPr>
-            <w:color w:val="4F46E5"/>
-            <w:u w:val="single"/>
-          </w:rPr>
-          <w:t xml:space="preserve">Trial balance, profit and loss, balance sheet</w:t>
-        </w:r>
-      </w:hyperlink>
-    </w:p>
-    <w:p>
-      <w:bookmarkStart w:id="148" w:name="receivables"/>
-      <w:pPr>
-        <w:pStyle w:val="Heading2"/>
-      </w:pPr>
-      <w:r>
-        <w:t>7.2  Receivables: who owes you</w:t>
-      </w:r>
-      <w:bookmarkEnd w:id="148"/>
-    </w:p>
-    <w:p>
-      <w:r>
-        <w:rPr>
-          <w:i/>
-          <w:color w:val="64748B"/>
-          <w:sz w:val="18"/>
-        </w:rPr>
-        <w:t>Screen: Accounts Receivables</w:t>
-      </w:r>
-    </w:p>
-    <w:p>
-      <w:r>
-        <w:rPr>
-          <w:b/>
-          <w:i w:val="0"/>
-        </w:rPr>
-        <w:t>Accounts → Accounts Receivables</w:t>
-      </w:r>
-      <w:r>
-        <w:rPr>
-          <w:b w:val="0"/>
-          <w:i w:val="0"/>
-        </w:rPr>
-        <w:t>.</w:t>
-      </w:r>
-    </w:p>
-    <w:p>
-      <w:pPr>
-        <w:jc w:val="center"/>
-      </w:pPr>
-      <w:r>
-        <w:drawing>
-          <wp:inline xmlns:a="http://schemas.openxmlformats.org/drawingml/2006/main" xmlns:pic="http://schemas.openxmlformats.org/drawingml/2006/picture">
-            <wp:extent cx="6120000" cy="3902609"/>
-            <wp:docPr id="56" name="Picture 56"/>
-            <wp:cNvGraphicFramePr>
-              <a:graphicFrameLocks noChangeAspect="1"/>
-            </wp:cNvGraphicFramePr>
-            <a:graphic>
-              <a:graphicData uri="http://schemas.openxmlformats.org/drawingml/2006/picture">
-                <pic:pic>
-                  <pic:nvPicPr>
-                    <pic:cNvPr id="0" name="81-receivables.png"/>
                     <pic:cNvPicPr/>
                   </pic:nvPicPr>
                   <pic:blipFill>
@@ -17799,6 +17621,212 @@
           <w:color w:val="64748B"/>
           <w:sz w:val="18"/>
         </w:rPr>
+        <w:t>Accounting dashboard</w:t>
+      </w:r>
+    </w:p>
+    <w:p>
+      <w:r>
+        <w:rPr>
+          <w:b w:val="0"/>
+          <w:i w:val="0"/>
+        </w:rPr>
+        <w:t xml:space="preserve">The cards show total receivables, payables, bank balance and net profit; the quick buttons open the other tabs: </w:t>
+      </w:r>
+      <w:r>
+        <w:rPr>
+          <w:b/>
+          <w:i w:val="0"/>
+        </w:rPr>
+        <w:t>Accounts Receivable (AR)</w:t>
+      </w:r>
+      <w:r>
+        <w:rPr>
+          <w:b w:val="0"/>
+          <w:i w:val="0"/>
+        </w:rPr>
+        <w:t xml:space="preserve">, </w:t>
+      </w:r>
+      <w:r>
+        <w:rPr>
+          <w:b/>
+          <w:i w:val="0"/>
+        </w:rPr>
+        <w:t>Accounts Payable (AP)</w:t>
+      </w:r>
+      <w:r>
+        <w:rPr>
+          <w:b w:val="0"/>
+          <w:i w:val="0"/>
+        </w:rPr>
+        <w:t xml:space="preserve">, </w:t>
+      </w:r>
+      <w:r>
+        <w:rPr>
+          <w:b/>
+          <w:i w:val="0"/>
+        </w:rPr>
+        <w:t>Banking &amp; BRS</w:t>
+      </w:r>
+      <w:r>
+        <w:rPr>
+          <w:b w:val="0"/>
+          <w:i w:val="0"/>
+        </w:rPr>
+        <w:t xml:space="preserve"> and </w:t>
+      </w:r>
+      <w:r>
+        <w:rPr>
+          <w:b/>
+          <w:i w:val="0"/>
+        </w:rPr>
+        <w:t>General Ledger</w:t>
+      </w:r>
+      <w:r>
+        <w:rPr>
+          <w:b w:val="0"/>
+          <w:i w:val="0"/>
+        </w:rPr>
+        <w:t>.</w:t>
+      </w:r>
+    </w:p>
+    <w:p>
+      <w:r>
+        <w:rPr>
+          <w:b/>
+        </w:rPr>
+        <w:t xml:space="preserve">See also: </w:t>
+      </w:r>
+      <w:hyperlink w:anchor="receivables">
+        <w:r>
+          <w:rPr>
+            <w:color w:val="4F46E5"/>
+            <w:u w:val="single"/>
+          </w:rPr>
+          <w:t xml:space="preserve">Receivables: who owes you</w:t>
+        </w:r>
+      </w:hyperlink>
+      <w:r>
+        <w:t xml:space="preserve">  ·  </w:t>
+      </w:r>
+      <w:hyperlink w:anchor="payables">
+        <w:r>
+          <w:rPr>
+            <w:color w:val="4F46E5"/>
+            <w:u w:val="single"/>
+          </w:rPr>
+          <w:t xml:space="preserve">Payables and supplier payments</w:t>
+        </w:r>
+      </w:hyperlink>
+      <w:r>
+        <w:t xml:space="preserve">  ·  </w:t>
+      </w:r>
+      <w:hyperlink w:anchor="banking">
+        <w:r>
+          <w:rPr>
+            <w:color w:val="4F46E5"/>
+            <w:u w:val="single"/>
+          </w:rPr>
+          <w:t xml:space="preserve">Banking and reconciliation</w:t>
+        </w:r>
+      </w:hyperlink>
+      <w:r>
+        <w:t xml:space="preserve">  ·  </w:t>
+      </w:r>
+      <w:hyperlink w:anchor="statements">
+        <w:r>
+          <w:rPr>
+            <w:color w:val="4F46E5"/>
+            <w:u w:val="single"/>
+          </w:rPr>
+          <w:t xml:space="preserve">Trial balance, profit and loss, balance sheet</w:t>
+        </w:r>
+      </w:hyperlink>
+    </w:p>
+    <w:p>
+      <w:bookmarkStart w:id="148" w:name="receivables"/>
+      <w:pPr>
+        <w:pStyle w:val="Heading2"/>
+      </w:pPr>
+      <w:r>
+        <w:t>7.2  Receivables: who owes you</w:t>
+      </w:r>
+      <w:bookmarkEnd w:id="148"/>
+    </w:p>
+    <w:p>
+      <w:r>
+        <w:rPr>
+          <w:i/>
+          <w:color w:val="64748B"/>
+          <w:sz w:val="18"/>
+        </w:rPr>
+        <w:t>Screen: Accounts Receivables</w:t>
+      </w:r>
+    </w:p>
+    <w:p>
+      <w:r>
+        <w:rPr>
+          <w:b/>
+          <w:i w:val="0"/>
+        </w:rPr>
+        <w:t>Accounts → Accounts Receivables</w:t>
+      </w:r>
+      <w:r>
+        <w:rPr>
+          <w:b w:val="0"/>
+          <w:i w:val="0"/>
+        </w:rPr>
+        <w:t>.</w:t>
+      </w:r>
+    </w:p>
+    <w:p>
+      <w:pPr>
+        <w:jc w:val="center"/>
+      </w:pPr>
+      <w:r>
+        <w:drawing>
+          <wp:inline xmlns:a="http://schemas.openxmlformats.org/drawingml/2006/main" xmlns:pic="http://schemas.openxmlformats.org/drawingml/2006/picture">
+            <wp:extent cx="6120000" cy="3902609"/>
+            <wp:docPr id="56" name="Picture 56"/>
+            <wp:cNvGraphicFramePr>
+              <a:graphicFrameLocks noChangeAspect="1"/>
+            </wp:cNvGraphicFramePr>
+            <a:graphic>
+              <a:graphicData uri="http://schemas.openxmlformats.org/drawingml/2006/picture">
+                <pic:pic>
+                  <pic:nvPicPr>
+                    <pic:cNvPr id="0" name="81-receivables.png"/>
+                    <pic:cNvPicPr/>
+                  </pic:nvPicPr>
+                  <pic:blipFill>
+                    <a:blip r:embed="rId63"/>
+                    <a:stretch>
+                      <a:fillRect/>
+                    </a:stretch>
+                  </pic:blipFill>
+                  <pic:spPr>
+                    <a:xfrm>
+                      <a:off x="0" y="0"/>
+                      <a:ext cx="6120000" cy="3902609"/>
+                    </a:xfrm>
+                    <a:prstGeom prst="rect"/>
+                  </pic:spPr>
+                </pic:pic>
+              </a:graphicData>
+            </a:graphic>
+          </wp:inline>
+        </w:drawing>
+      </w:r>
+    </w:p>
+    <w:p>
+      <w:pPr>
+        <w:jc w:val="center"/>
+      </w:pPr>
+      <w:r>
+        <w:rPr>
+          <w:i/>
+          <w:color w:val="64748B"/>
+          <w:sz w:val="18"/>
+        </w:rPr>
         <w:t>Receivables</w:t>
       </w:r>
     </w:p>
@@ -18204,7 +18232,7 @@
                     <pic:cNvPicPr/>
                   </pic:nvPicPr>
                   <pic:blipFill>
-                    <a:blip r:embed="rId63"/>
+                    <a:blip r:embed="rId64"/>
                     <a:stretch>
                       <a:fillRect/>
                     </a:stretch>
@@ -18377,7 +18405,7 @@
                     <pic:cNvPicPr/>
                   </pic:nvPicPr>
                   <pic:blipFill>
-                    <a:blip r:embed="rId64"/>
+                    <a:blip r:embed="rId65"/>
                     <a:stretch>
                       <a:fillRect/>
                     </a:stretch>
@@ -18598,7 +18626,7 @@
                     <pic:cNvPicPr/>
                   </pic:nvPicPr>
                   <pic:blipFill>
-                    <a:blip r:embed="rId65"/>
+                    <a:blip r:embed="rId66"/>
                     <a:stretch>
                       <a:fillRect/>
                     </a:stretch>
@@ -18824,7 +18852,7 @@
                     <pic:cNvPicPr/>
                   </pic:nvPicPr>
                   <pic:blipFill>
-                    <a:blip r:embed="rId66"/>
+                    <a:blip r:embed="rId67"/>
                     <a:stretch>
                       <a:fillRect/>
                     </a:stretch>
@@ -18950,7 +18978,7 @@
                     <pic:cNvPicPr/>
                   </pic:nvPicPr>
                   <pic:blipFill>
-                    <a:blip r:embed="rId67"/>
+                    <a:blip r:embed="rId68"/>
                     <a:stretch>
                       <a:fillRect/>
                     </a:stretch>
@@ -19025,7 +19053,7 @@
                     <pic:cNvPicPr/>
                   </pic:nvPicPr>
                   <pic:blipFill>
-                    <a:blip r:embed="rId68"/>
+                    <a:blip r:embed="rId69"/>
                     <a:stretch>
                       <a:fillRect/>
                     </a:stretch>
@@ -19435,7 +19463,7 @@
                     <pic:cNvPicPr/>
                   </pic:nvPicPr>
                   <pic:blipFill>
-                    <a:blip r:embed="rId69"/>
+                    <a:blip r:embed="rId70"/>
                     <a:stretch>
                       <a:fillRect/>
                     </a:stretch>
@@ -19614,7 +19642,7 @@
                     <pic:cNvPicPr/>
                   </pic:nvPicPr>
                   <pic:blipFill>
-                    <a:blip r:embed="rId70"/>
+                    <a:blip r:embed="rId71"/>
                     <a:stretch>
                       <a:fillRect/>
                     </a:stretch>
@@ -19737,58 +19765,6 @@
                 <pic:pic>
                   <pic:nvPicPr>
                     <pic:cNvPr id="0" name="90-trial-balance.png"/>
-                    <pic:cNvPicPr/>
-                  </pic:nvPicPr>
-                  <pic:blipFill>
-                    <a:blip r:embed="rId71"/>
-                    <a:stretch>
-                      <a:fillRect/>
-                    </a:stretch>
-                  </pic:blipFill>
-                  <pic:spPr>
-                    <a:xfrm>
-                      <a:off x="0" y="0"/>
-                      <a:ext cx="5486400" cy="4800600"/>
-                    </a:xfrm>
-                    <a:prstGeom prst="rect"/>
-                  </pic:spPr>
-                </pic:pic>
-              </a:graphicData>
-            </a:graphic>
-          </wp:inline>
-        </w:drawing>
-      </w:r>
-    </w:p>
-    <w:p>
-      <w:pPr>
-        <w:jc w:val="center"/>
-      </w:pPr>
-      <w:r>
-        <w:rPr>
-          <w:i/>
-          <w:color w:val="64748B"/>
-          <w:sz w:val="18"/>
-        </w:rPr>
-        <w:t>Trial balance</w:t>
-      </w:r>
-    </w:p>
-    <w:p>
-      <w:pPr>
-        <w:jc w:val="center"/>
-      </w:pPr>
-      <w:r>
-        <w:drawing>
-          <wp:inline xmlns:a="http://schemas.openxmlformats.org/drawingml/2006/main" xmlns:pic="http://schemas.openxmlformats.org/drawingml/2006/picture">
-            <wp:extent cx="5486400" cy="4800600"/>
-            <wp:docPr id="66" name="Picture 66"/>
-            <wp:cNvGraphicFramePr>
-              <a:graphicFrameLocks noChangeAspect="1"/>
-            </wp:cNvGraphicFramePr>
-            <a:graphic>
-              <a:graphicData uri="http://schemas.openxmlformats.org/drawingml/2006/picture">
-                <pic:pic>
-                  <pic:nvPicPr>
-                    <pic:cNvPr id="0" name="91-profit-and-loss.png"/>
                     <pic:cNvPicPr/>
                   </pic:nvPicPr>
                   <pic:blipFill>
@@ -19821,7 +19797,7 @@
           <w:color w:val="64748B"/>
           <w:sz w:val="18"/>
         </w:rPr>
-        <w:t>Profit and loss</w:t>
+        <w:t>Trial balance</w:t>
       </w:r>
     </w:p>
     <w:p>
@@ -19832,7 +19808,7 @@
         <w:drawing>
           <wp:inline xmlns:a="http://schemas.openxmlformats.org/drawingml/2006/main" xmlns:pic="http://schemas.openxmlformats.org/drawingml/2006/picture">
             <wp:extent cx="5486400" cy="4800600"/>
-            <wp:docPr id="67" name="Picture 67"/>
+            <wp:docPr id="66" name="Picture 66"/>
             <wp:cNvGraphicFramePr>
               <a:graphicFrameLocks noChangeAspect="1"/>
             </wp:cNvGraphicFramePr>
@@ -19840,7 +19816,7 @@
               <a:graphicData uri="http://schemas.openxmlformats.org/drawingml/2006/picture">
                 <pic:pic>
                   <pic:nvPicPr>
-                    <pic:cNvPr id="0" name="92-balance-sheet.png"/>
+                    <pic:cNvPr id="0" name="91-profit-and-loss.png"/>
                     <pic:cNvPicPr/>
                   </pic:nvPicPr>
                   <pic:blipFill>
@@ -19873,6 +19849,58 @@
           <w:color w:val="64748B"/>
           <w:sz w:val="18"/>
         </w:rPr>
+        <w:t>Profit and loss</w:t>
+      </w:r>
+    </w:p>
+    <w:p>
+      <w:pPr>
+        <w:jc w:val="center"/>
+      </w:pPr>
+      <w:r>
+        <w:drawing>
+          <wp:inline xmlns:a="http://schemas.openxmlformats.org/drawingml/2006/main" xmlns:pic="http://schemas.openxmlformats.org/drawingml/2006/picture">
+            <wp:extent cx="5486400" cy="4800600"/>
+            <wp:docPr id="67" name="Picture 67"/>
+            <wp:cNvGraphicFramePr>
+              <a:graphicFrameLocks noChangeAspect="1"/>
+            </wp:cNvGraphicFramePr>
+            <a:graphic>
+              <a:graphicData uri="http://schemas.openxmlformats.org/drawingml/2006/picture">
+                <pic:pic>
+                  <pic:nvPicPr>
+                    <pic:cNvPr id="0" name="92-balance-sheet.png"/>
+                    <pic:cNvPicPr/>
+                  </pic:nvPicPr>
+                  <pic:blipFill>
+                    <a:blip r:embed="rId74"/>
+                    <a:stretch>
+                      <a:fillRect/>
+                    </a:stretch>
+                  </pic:blipFill>
+                  <pic:spPr>
+                    <a:xfrm>
+                      <a:off x="0" y="0"/>
+                      <a:ext cx="5486400" cy="4800600"/>
+                    </a:xfrm>
+                    <a:prstGeom prst="rect"/>
+                  </pic:spPr>
+                </pic:pic>
+              </a:graphicData>
+            </a:graphic>
+          </wp:inline>
+        </w:drawing>
+      </w:r>
+    </w:p>
+    <w:p>
+      <w:pPr>
+        <w:jc w:val="center"/>
+      </w:pPr>
+      <w:r>
+        <w:rPr>
+          <w:i/>
+          <w:color w:val="64748B"/>
+          <w:sz w:val="18"/>
+        </w:rPr>
         <w:t>Balance sheet</w:t>
       </w:r>
     </w:p>
@@ -20027,273 +20055,6 @@
                 <pic:pic>
                   <pic:nvPicPr>
                     <pic:cNvPr id="0" name="93-integrity-check.png"/>
-                    <pic:cNvPicPr/>
-                  </pic:nvPicPr>
-                  <pic:blipFill>
-                    <a:blip r:embed="rId74"/>
-                    <a:stretch>
-                      <a:fillRect/>
-                    </a:stretch>
-                  </pic:blipFill>
-                  <pic:spPr>
-                    <a:xfrm>
-                      <a:off x="0" y="0"/>
-                      <a:ext cx="6120000" cy="3902609"/>
-                    </a:xfrm>
-                    <a:prstGeom prst="rect"/>
-                  </pic:spPr>
-                </pic:pic>
-              </a:graphicData>
-            </a:graphic>
-          </wp:inline>
-        </w:drawing>
-      </w:r>
-    </w:p>
-    <w:p>
-      <w:pPr>
-        <w:jc w:val="center"/>
-      </w:pPr>
-      <w:r>
-        <w:rPr>
-          <w:i/>
-          <w:color w:val="64748B"/>
-          <w:sz w:val="18"/>
-        </w:rPr>
-        <w:t>Integrity check</w:t>
-      </w:r>
-    </w:p>
-    <w:p>
-      <w:r>
-        <w:rPr>
-          <w:b w:val="0"/>
-          <w:i w:val="0"/>
-        </w:rPr>
-        <w:t xml:space="preserve">Each line is </w:t>
-      </w:r>
-      <w:r>
-        <w:rPr>
-          <w:b/>
-          <w:i w:val="0"/>
-        </w:rPr>
-        <w:t>OK</w:t>
-      </w:r>
-      <w:r>
-        <w:rPr>
-          <w:b w:val="0"/>
-          <w:i w:val="0"/>
-        </w:rPr>
-        <w:t xml:space="preserve">, </w:t>
-      </w:r>
-      <w:r>
-        <w:rPr>
-          <w:b/>
-          <w:i w:val="0"/>
-        </w:rPr>
-        <w:t>Info</w:t>
-      </w:r>
-      <w:r>
-        <w:rPr>
-          <w:b w:val="0"/>
-          <w:i w:val="0"/>
-        </w:rPr>
-        <w:t xml:space="preserve">, </w:t>
-      </w:r>
-      <w:r>
-        <w:rPr>
-          <w:b/>
-          <w:i w:val="0"/>
-        </w:rPr>
-        <w:t>Warning</w:t>
-      </w:r>
-      <w:r>
-        <w:rPr>
-          <w:b w:val="0"/>
-          <w:i w:val="0"/>
-        </w:rPr>
-        <w:t xml:space="preserve"> or </w:t>
-      </w:r>
-      <w:r>
-        <w:rPr>
-          <w:b/>
-          <w:i w:val="0"/>
-        </w:rPr>
-        <w:t>Fail</w:t>
-      </w:r>
-      <w:r>
-        <w:rPr>
-          <w:b w:val="0"/>
-          <w:i w:val="0"/>
-        </w:rPr>
-        <w:t xml:space="preserve">: journals balance, receivables equal customer balances, bills add up, statuses agree with balances, invoice numbers are unique, stock is not negative, and more. Open a line to see exactly which records. </w:t>
-      </w:r>
-      <w:r>
-        <w:rPr>
-          <w:b/>
-          <w:i w:val="0"/>
-        </w:rPr>
-        <w:t>Save Report…</w:t>
-      </w:r>
-      <w:r>
-        <w:rPr>
-          <w:b w:val="0"/>
-          <w:i w:val="0"/>
-        </w:rPr>
-        <w:t xml:space="preserve"> keeps a copy. Run it before closing the month and after restoring a backup.</w:t>
-      </w:r>
-    </w:p>
-    <w:p>
-      <w:r>
-        <w:rPr>
-          <w:b/>
-        </w:rPr>
-        <w:t xml:space="preserve">See also: </w:t>
-      </w:r>
-      <w:hyperlink w:anchor="statements">
-        <w:r>
-          <w:rPr>
-            <w:color w:val="4F46E5"/>
-            <w:u w:val="single"/>
-          </w:rPr>
-          <w:t xml:space="preserve">Trial balance, profit and loss, balance sheet</w:t>
-        </w:r>
-      </w:hyperlink>
-      <w:r>
-        <w:t xml:space="preserve">  ·  </w:t>
-      </w:r>
-      <w:hyperlink w:anchor="backup">
-        <w:r>
-          <w:rPr>
-            <w:color w:val="4F46E5"/>
-            <w:u w:val="single"/>
-          </w:rPr>
-          <w:t xml:space="preserve">Backup and database</w:t>
-        </w:r>
-      </w:hyperlink>
-    </w:p>
-    <w:p>
-      <w:r>
-        <w:br w:type="page"/>
-      </w:r>
-    </w:p>
-    <w:p>
-      <w:bookmarkStart w:id="157" w:name="chapter-reports"/>
-      <w:pPr>
-        <w:pStyle w:val="Heading1"/>
-      </w:pPr>
-      <w:r>
-        <w:t>Chapter 8. Reports</w:t>
-      </w:r>
-      <w:bookmarkEnd w:id="157"/>
-    </w:p>
-    <w:p>
-      <w:bookmarkStart w:id="158" w:name="daybook"/>
-      <w:pPr>
-        <w:pStyle w:val="Heading2"/>
-      </w:pPr>
-      <w:r>
-        <w:t>8.1  Daybook</w:t>
-      </w:r>
-      <w:bookmarkEnd w:id="158"/>
-    </w:p>
-    <w:p>
-      <w:r>
-        <w:rPr>
-          <w:i/>
-          <w:color w:val="64748B"/>
-          <w:sz w:val="18"/>
-        </w:rPr>
-        <w:t>Screen: Reports</w:t>
-      </w:r>
-    </w:p>
-    <w:p>
-      <w:r>
-        <w:rPr>
-          <w:b/>
-          <w:i w:val="0"/>
-        </w:rPr>
-        <w:t>Reports → Daybook</w:t>
-      </w:r>
-      <w:r>
-        <w:rPr>
-          <w:b w:val="0"/>
-          <w:i w:val="0"/>
-        </w:rPr>
-        <w:t xml:space="preserve">: every event in date order: sales, returns, purchases, receipts and supplier payments, with </w:t>
-      </w:r>
-      <w:r>
-        <w:rPr>
-          <w:b/>
-          <w:i w:val="0"/>
-        </w:rPr>
-        <w:t>Billed</w:t>
-      </w:r>
-      <w:r>
-        <w:rPr>
-          <w:b w:val="0"/>
-          <w:i w:val="0"/>
-        </w:rPr>
-        <w:t xml:space="preserve">, </w:t>
-      </w:r>
-      <w:r>
-        <w:rPr>
-          <w:b/>
-          <w:i w:val="0"/>
-        </w:rPr>
-        <w:t>Bought</w:t>
-      </w:r>
-      <w:r>
-        <w:rPr>
-          <w:b w:val="0"/>
-          <w:i w:val="0"/>
-        </w:rPr>
-        <w:t xml:space="preserve">, </w:t>
-      </w:r>
-      <w:r>
-        <w:rPr>
-          <w:b/>
-          <w:i w:val="0"/>
-        </w:rPr>
-        <w:t>Money in</w:t>
-      </w:r>
-      <w:r>
-        <w:rPr>
-          <w:b w:val="0"/>
-          <w:i w:val="0"/>
-        </w:rPr>
-        <w:t xml:space="preserve"> and </w:t>
-      </w:r>
-      <w:r>
-        <w:rPr>
-          <w:b/>
-          <w:i w:val="0"/>
-        </w:rPr>
-        <w:t>Money out</w:t>
-      </w:r>
-      <w:r>
-        <w:rPr>
-          <w:b w:val="0"/>
-          <w:i w:val="0"/>
-        </w:rPr>
-        <w:t xml:space="preserve"> and a total line.</w:t>
-      </w:r>
-    </w:p>
-    <w:p>
-      <w:pPr>
-        <w:jc w:val="center"/>
-      </w:pPr>
-      <w:r>
-        <w:drawing>
-          <wp:inline xmlns:a="http://schemas.openxmlformats.org/drawingml/2006/main" xmlns:pic="http://schemas.openxmlformats.org/drawingml/2006/picture">
-            <wp:extent cx="6120000" cy="3902609"/>
-            <wp:docPr id="69" name="Picture 69"/>
-            <wp:cNvGraphicFramePr>
-              <a:graphicFrameLocks noChangeAspect="1"/>
-            </wp:cNvGraphicFramePr>
-            <a:graphic>
-              <a:graphicData uri="http://schemas.openxmlformats.org/drawingml/2006/picture">
-                <pic:pic>
-                  <pic:nvPicPr>
-                    <pic:cNvPr id="0" name="100-daybook.png"/>
                     <pic:cNvPicPr/>
                   </pic:nvPicPr>
                   <pic:blipFill>
@@ -20326,140 +20087,141 @@
           <w:color w:val="64748B"/>
           <w:sz w:val="18"/>
         </w:rPr>
-        <w:t>Daybook</w:t>
-      </w:r>
-    </w:p>
-    <w:p>
-      <w:r>
-        <w:rPr>
-          <w:b w:val="0"/>
-          <w:i w:val="0"/>
-        </w:rPr>
-        <w:t xml:space="preserve">Choose the period with the </w:t>
+        <w:t>Integrity check</w:t>
+      </w:r>
+    </w:p>
+    <w:p>
+      <w:r>
+        <w:rPr>
+          <w:b w:val="0"/>
+          <w:i w:val="0"/>
+        </w:rPr>
+        <w:t xml:space="preserve">Each line is </w:t>
       </w:r>
       <w:r>
         <w:rPr>
           <w:b/>
           <w:i w:val="0"/>
         </w:rPr>
-        <w:t>From / To</w:t>
-      </w:r>
-      <w:r>
-        <w:rPr>
-          <w:b w:val="0"/>
-          <w:i w:val="0"/>
-        </w:rPr>
-        <w:t xml:space="preserve"> boxes (</w:t>
-      </w:r>
-      <w:hyperlink w:anchor="report-dates">
-        <w:r>
-          <w:rPr>
-            <w:color w:val="4F46E5"/>
-            <w:u w:val="single"/>
-          </w:rPr>
-          <w:t xml:space="preserve">dates in reports</w:t>
-        </w:r>
-      </w:hyperlink>
-      <w:r>
-        <w:rPr>
-          <w:b w:val="0"/>
-          <w:i w:val="0"/>
-        </w:rPr>
-        <w:t xml:space="preserve">), or </w:t>
+        <w:t>OK</w:t>
+      </w:r>
+      <w:r>
+        <w:rPr>
+          <w:b w:val="0"/>
+          <w:i w:val="0"/>
+        </w:rPr>
+        <w:t xml:space="preserve">, </w:t>
       </w:r>
       <w:r>
         <w:rPr>
           <w:b/>
           <w:i w:val="0"/>
         </w:rPr>
-        <w:t>Today</w:t>
-      </w:r>
-      <w:r>
-        <w:rPr>
-          <w:b w:val="0"/>
-          <w:i w:val="0"/>
-        </w:rPr>
-        <w:t xml:space="preserve"> / </w:t>
+        <w:t>Info</w:t>
+      </w:r>
+      <w:r>
+        <w:rPr>
+          <w:b w:val="0"/>
+          <w:i w:val="0"/>
+        </w:rPr>
+        <w:t xml:space="preserve">, </w:t>
       </w:r>
       <w:r>
         <w:rPr>
           <w:b/>
           <w:i w:val="0"/>
         </w:rPr>
-        <w:t>This month</w:t>
-      </w:r>
-      <w:r>
-        <w:rPr>
-          <w:b w:val="0"/>
-          <w:i w:val="0"/>
-        </w:rPr>
-        <w:t xml:space="preserve">. </w:t>
+        <w:t>Warning</w:t>
+      </w:r>
+      <w:r>
+        <w:rPr>
+          <w:b w:val="0"/>
+          <w:i w:val="0"/>
+        </w:rPr>
+        <w:t xml:space="preserve"> or </w:t>
       </w:r>
       <w:r>
         <w:rPr>
           <w:b/>
           <w:i w:val="0"/>
         </w:rPr>
-        <w:t>Export CSV</w:t>
-      </w:r>
-      <w:r>
-        <w:rPr>
-          <w:b w:val="0"/>
-          <w:i w:val="0"/>
-        </w:rPr>
-        <w:t xml:space="preserve"> saves it.</w:t>
-      </w:r>
-    </w:p>
-    <w:p>
+        <w:t>Fail</w:t>
+      </w:r>
+      <w:r>
+        <w:rPr>
+          <w:b w:val="0"/>
+          <w:i w:val="0"/>
+        </w:rPr>
+        <w:t xml:space="preserve">: journals balance, receivables equal customer balances, bills add up, statuses agree with balances, invoice numbers are unique, stock is not negative, and more. Open a line to see exactly which records. </w:t>
+      </w:r>
       <w:r>
         <w:rPr>
           <w:b/>
+          <w:i w:val="0"/>
+        </w:rPr>
+        <w:t>Save Report…</w:t>
+      </w:r>
+      <w:r>
+        <w:rPr>
+          <w:b w:val="0"/>
+          <w:i w:val="0"/>
+        </w:rPr>
+        <w:t xml:space="preserve"> keeps a copy. Run it before closing the month and after restoring a backup.</w:t>
+      </w:r>
+    </w:p>
+    <w:p>
+      <w:r>
+        <w:rPr>
+          <w:b/>
         </w:rPr>
         <w:t xml:space="preserve">See also: </w:t>
       </w:r>
-      <w:hyperlink w:anchor="item-wise">
-        <w:r>
-          <w:rPr>
-            <w:color w:val="4F46E5"/>
-            <w:u w:val="single"/>
-          </w:rPr>
-          <w:t xml:space="preserve">Item-wise sales</w:t>
+      <w:hyperlink w:anchor="statements">
+        <w:r>
+          <w:rPr>
+            <w:color w:val="4F46E5"/>
+            <w:u w:val="single"/>
+          </w:rPr>
+          <w:t xml:space="preserve">Trial balance, profit and loss, balance sheet</w:t>
         </w:r>
       </w:hyperlink>
       <w:r>
         <w:t xml:space="preserve">  ·  </w:t>
       </w:r>
-      <w:hyperlink w:anchor="customer-wise">
-        <w:r>
-          <w:rPr>
-            <w:color w:val="4F46E5"/>
-            <w:u w:val="single"/>
-          </w:rPr>
-          <w:t xml:space="preserve">Customer-wise sales</w:t>
-        </w:r>
-      </w:hyperlink>
-      <w:r>
-        <w:t xml:space="preserve">  ·  </w:t>
-      </w:r>
-      <w:hyperlink w:anchor="report-dates">
-        <w:r>
-          <w:rPr>
-            <w:color w:val="4F46E5"/>
-            <w:u w:val="single"/>
-          </w:rPr>
-          <w:t xml:space="preserve">Dates in reports</w:t>
-        </w:r>
-      </w:hyperlink>
-    </w:p>
-    <w:p>
-      <w:bookmarkStart w:id="159" w:name="item-wise"/>
+      <w:hyperlink w:anchor="backup">
+        <w:r>
+          <w:rPr>
+            <w:color w:val="4F46E5"/>
+            <w:u w:val="single"/>
+          </w:rPr>
+          <w:t xml:space="preserve">Backup and database</w:t>
+        </w:r>
+      </w:hyperlink>
+    </w:p>
+    <w:p>
+      <w:r>
+        <w:br w:type="page"/>
+      </w:r>
+    </w:p>
+    <w:p>
+      <w:bookmarkStart w:id="157" w:name="chapter-reports"/>
+      <w:pPr>
+        <w:pStyle w:val="Heading1"/>
+      </w:pPr>
+      <w:r>
+        <w:t>Chapter 8. Reports</w:t>
+      </w:r>
+      <w:bookmarkEnd w:id="157"/>
+    </w:p>
+    <w:p>
+      <w:bookmarkStart w:id="158" w:name="daybook"/>
       <w:pPr>
         <w:pStyle w:val="Heading2"/>
       </w:pPr>
       <w:r>
-        <w:t>8.2  Item-wise sales</w:t>
-      </w:r>
-      <w:bookmarkEnd w:id="159"/>
+        <w:t>8.1  Daybook</w:t>
+      </w:r>
+      <w:bookmarkEnd w:id="158"/>
     </w:p>
     <w:p>
       <w:r>
@@ -20477,14 +20239,70 @@
           <w:b/>
           <w:i w:val="0"/>
         </w:rPr>
-        <w:t>Reports → Item-wise Sales</w:t>
-      </w:r>
-      <w:r>
-        <w:rPr>
-          <w:b w:val="0"/>
-          <w:i w:val="0"/>
-        </w:rPr>
-        <w:t>: for each item the bills it was on, quantity sold, quantity returned, net quantity, average rate and net amount, best sellers first.</w:t>
+        <w:t>Reports → Daybook</w:t>
+      </w:r>
+      <w:r>
+        <w:rPr>
+          <w:b w:val="0"/>
+          <w:i w:val="0"/>
+        </w:rPr>
+        <w:t xml:space="preserve">: every event in date order: sales, returns, purchases, receipts and supplier payments, with </w:t>
+      </w:r>
+      <w:r>
+        <w:rPr>
+          <w:b/>
+          <w:i w:val="0"/>
+        </w:rPr>
+        <w:t>Billed</w:t>
+      </w:r>
+      <w:r>
+        <w:rPr>
+          <w:b w:val="0"/>
+          <w:i w:val="0"/>
+        </w:rPr>
+        <w:t xml:space="preserve">, </w:t>
+      </w:r>
+      <w:r>
+        <w:rPr>
+          <w:b/>
+          <w:i w:val="0"/>
+        </w:rPr>
+        <w:t>Bought</w:t>
+      </w:r>
+      <w:r>
+        <w:rPr>
+          <w:b w:val="0"/>
+          <w:i w:val="0"/>
+        </w:rPr>
+        <w:t xml:space="preserve">, </w:t>
+      </w:r>
+      <w:r>
+        <w:rPr>
+          <w:b/>
+          <w:i w:val="0"/>
+        </w:rPr>
+        <w:t>Money in</w:t>
+      </w:r>
+      <w:r>
+        <w:rPr>
+          <w:b w:val="0"/>
+          <w:i w:val="0"/>
+        </w:rPr>
+        <w:t xml:space="preserve"> and </w:t>
+      </w:r>
+      <w:r>
+        <w:rPr>
+          <w:b/>
+          <w:i w:val="0"/>
+        </w:rPr>
+        <w:t>Money out</w:t>
+      </w:r>
+      <w:r>
+        <w:rPr>
+          <w:b w:val="0"/>
+          <w:i w:val="0"/>
+        </w:rPr>
+        <w:t xml:space="preserve"> and a total line.</w:t>
       </w:r>
     </w:p>
     <w:p>
@@ -20495,7 +20313,7 @@
         <w:drawing>
           <wp:inline xmlns:a="http://schemas.openxmlformats.org/drawingml/2006/main" xmlns:pic="http://schemas.openxmlformats.org/drawingml/2006/picture">
             <wp:extent cx="6120000" cy="3902609"/>
-            <wp:docPr id="70" name="Picture 70"/>
+            <wp:docPr id="69" name="Picture 69"/>
             <wp:cNvGraphicFramePr>
               <a:graphicFrameLocks noChangeAspect="1"/>
             </wp:cNvGraphicFramePr>
@@ -20503,7 +20321,7 @@
               <a:graphicData uri="http://schemas.openxmlformats.org/drawingml/2006/picture">
                 <pic:pic>
                   <pic:nvPicPr>
-                    <pic:cNvPr id="0" name="101-item-wise-sales.png"/>
+                    <pic:cNvPr id="0" name="100-daybook.png"/>
                     <pic:cNvPicPr/>
                   </pic:nvPicPr>
                   <pic:blipFill>
@@ -20536,23 +20354,104 @@
           <w:color w:val="64748B"/>
           <w:sz w:val="18"/>
         </w:rPr>
-        <w:t>Item-wise sales</w:t>
-      </w:r>
-    </w:p>
-    <w:p>
+        <w:t>Daybook</w:t>
+      </w:r>
+    </w:p>
+    <w:p>
+      <w:r>
+        <w:rPr>
+          <w:b w:val="0"/>
+          <w:i w:val="0"/>
+        </w:rPr>
+        <w:t xml:space="preserve">Choose the period with the </w:t>
+      </w:r>
       <w:r>
         <w:rPr>
           <w:b/>
+          <w:i w:val="0"/>
+        </w:rPr>
+        <w:t>From / To</w:t>
+      </w:r>
+      <w:r>
+        <w:rPr>
+          <w:b w:val="0"/>
+          <w:i w:val="0"/>
+        </w:rPr>
+        <w:t xml:space="preserve"> boxes (</w:t>
+      </w:r>
+      <w:hyperlink w:anchor="report-dates">
+        <w:r>
+          <w:rPr>
+            <w:color w:val="4F46E5"/>
+            <w:u w:val="single"/>
+          </w:rPr>
+          <w:t xml:space="preserve">dates in reports</w:t>
+        </w:r>
+      </w:hyperlink>
+      <w:r>
+        <w:rPr>
+          <w:b w:val="0"/>
+          <w:i w:val="0"/>
+        </w:rPr>
+        <w:t xml:space="preserve">), or </w:t>
+      </w:r>
+      <w:r>
+        <w:rPr>
+          <w:b/>
+          <w:i w:val="0"/>
+        </w:rPr>
+        <w:t>Today</w:t>
+      </w:r>
+      <w:r>
+        <w:rPr>
+          <w:b w:val="0"/>
+          <w:i w:val="0"/>
+        </w:rPr>
+        <w:t xml:space="preserve"> / </w:t>
+      </w:r>
+      <w:r>
+        <w:rPr>
+          <w:b/>
+          <w:i w:val="0"/>
+        </w:rPr>
+        <w:t>This month</w:t>
+      </w:r>
+      <w:r>
+        <w:rPr>
+          <w:b w:val="0"/>
+          <w:i w:val="0"/>
+        </w:rPr>
+        <w:t xml:space="preserve">. </w:t>
+      </w:r>
+      <w:r>
+        <w:rPr>
+          <w:b/>
+          <w:i w:val="0"/>
+        </w:rPr>
+        <w:t>Export CSV</w:t>
+      </w:r>
+      <w:r>
+        <w:rPr>
+          <w:b w:val="0"/>
+          <w:i w:val="0"/>
+        </w:rPr>
+        <w:t xml:space="preserve"> saves it.</w:t>
+      </w:r>
+    </w:p>
+    <w:p>
+      <w:r>
+        <w:rPr>
+          <w:b/>
         </w:rPr>
         <w:t xml:space="preserve">See also: </w:t>
       </w:r>
-      <w:hyperlink w:anchor="daybook">
-        <w:r>
-          <w:rPr>
-            <w:color w:val="4F46E5"/>
-            <w:u w:val="single"/>
-          </w:rPr>
-          <w:t xml:space="preserve">Daybook</w:t>
+      <w:hyperlink w:anchor="item-wise">
+        <w:r>
+          <w:rPr>
+            <w:color w:val="4F46E5"/>
+            <w:u w:val="single"/>
+          </w:rPr>
+          <w:t xml:space="preserve">Item-wise sales</w:t>
         </w:r>
       </w:hyperlink>
       <w:r>
@@ -20567,16 +20466,28 @@
           <w:t xml:space="preserve">Customer-wise sales</w:t>
         </w:r>
       </w:hyperlink>
-    </w:p>
-    <w:p>
-      <w:bookmarkStart w:id="160" w:name="customer-wise"/>
+      <w:r>
+        <w:t xml:space="preserve">  ·  </w:t>
+      </w:r>
+      <w:hyperlink w:anchor="report-dates">
+        <w:r>
+          <w:rPr>
+            <w:color w:val="4F46E5"/>
+            <w:u w:val="single"/>
+          </w:rPr>
+          <w:t xml:space="preserve">Dates in reports</w:t>
+        </w:r>
+      </w:hyperlink>
+    </w:p>
+    <w:p>
+      <w:bookmarkStart w:id="159" w:name="item-wise"/>
       <w:pPr>
         <w:pStyle w:val="Heading2"/>
       </w:pPr>
       <w:r>
-        <w:t>8.3  Customer-wise sales</w:t>
-      </w:r>
-      <w:bookmarkEnd w:id="160"/>
+        <w:t>8.2  Item-wise sales</w:t>
+      </w:r>
+      <w:bookmarkEnd w:id="159"/>
     </w:p>
     <w:p>
       <w:r>
@@ -20594,42 +20505,14 @@
           <w:b/>
           <w:i w:val="0"/>
         </w:rPr>
-        <w:t>Reports → Customer-wise Sales</w:t>
-      </w:r>
-      <w:r>
-        <w:rPr>
-          <w:b w:val="0"/>
-          <w:i w:val="0"/>
-        </w:rPr>
-        <w:t xml:space="preserve">: bills, billed, returned, </w:t>
-      </w:r>
-      <w:r>
-        <w:rPr>
-          <w:b/>
-          <w:i w:val="0"/>
-        </w:rPr>
-        <w:t>net sales</w:t>
-      </w:r>
-      <w:r>
-        <w:rPr>
-          <w:b w:val="0"/>
-          <w:i w:val="0"/>
-        </w:rPr>
-        <w:t xml:space="preserve"> and what each customer </w:t>
-      </w:r>
-      <w:r>
-        <w:rPr>
-          <w:b/>
-          <w:i w:val="0"/>
-        </w:rPr>
-        <w:t>owes now</w:t>
-      </w:r>
-      <w:r>
-        <w:rPr>
-          <w:b w:val="0"/>
-          <w:i w:val="0"/>
-        </w:rPr>
-        <w:t>.</w:t>
+        <w:t>Reports → Item-wise Sales</w:t>
+      </w:r>
+      <w:r>
+        <w:rPr>
+          <w:b w:val="0"/>
+          <w:i w:val="0"/>
+        </w:rPr>
+        <w:t>: for each item the bills it was on, quantity sold, quantity returned, net quantity, average rate and net amount, best sellers first.</w:t>
       </w:r>
     </w:p>
     <w:p>
@@ -20640,7 +20523,7 @@
         <w:drawing>
           <wp:inline xmlns:a="http://schemas.openxmlformats.org/drawingml/2006/main" xmlns:pic="http://schemas.openxmlformats.org/drawingml/2006/picture">
             <wp:extent cx="6120000" cy="3902609"/>
-            <wp:docPr id="71" name="Picture 71"/>
+            <wp:docPr id="70" name="Picture 70"/>
             <wp:cNvGraphicFramePr>
               <a:graphicFrameLocks noChangeAspect="1"/>
             </wp:cNvGraphicFramePr>
@@ -20648,7 +20531,7 @@
               <a:graphicData uri="http://schemas.openxmlformats.org/drawingml/2006/picture">
                 <pic:pic>
                   <pic:nvPicPr>
-                    <pic:cNvPr id="0" name="102-customer-wise-sales.png"/>
+                    <pic:cNvPr id="0" name="101-item-wise-sales.png"/>
                     <pic:cNvPicPr/>
                   </pic:nvPicPr>
                   <pic:blipFill>
@@ -20681,6 +20564,151 @@
           <w:color w:val="64748B"/>
           <w:sz w:val="18"/>
         </w:rPr>
+        <w:t>Item-wise sales</w:t>
+      </w:r>
+    </w:p>
+    <w:p>
+      <w:r>
+        <w:rPr>
+          <w:b/>
+        </w:rPr>
+        <w:t xml:space="preserve">See also: </w:t>
+      </w:r>
+      <w:hyperlink w:anchor="daybook">
+        <w:r>
+          <w:rPr>
+            <w:color w:val="4F46E5"/>
+            <w:u w:val="single"/>
+          </w:rPr>
+          <w:t xml:space="preserve">Daybook</w:t>
+        </w:r>
+      </w:hyperlink>
+      <w:r>
+        <w:t xml:space="preserve">  ·  </w:t>
+      </w:r>
+      <w:hyperlink w:anchor="customer-wise">
+        <w:r>
+          <w:rPr>
+            <w:color w:val="4F46E5"/>
+            <w:u w:val="single"/>
+          </w:rPr>
+          <w:t xml:space="preserve">Customer-wise sales</w:t>
+        </w:r>
+      </w:hyperlink>
+    </w:p>
+    <w:p>
+      <w:bookmarkStart w:id="160" w:name="customer-wise"/>
+      <w:pPr>
+        <w:pStyle w:val="Heading2"/>
+      </w:pPr>
+      <w:r>
+        <w:t>8.3  Customer-wise sales</w:t>
+      </w:r>
+      <w:bookmarkEnd w:id="160"/>
+    </w:p>
+    <w:p>
+      <w:r>
+        <w:rPr>
+          <w:i/>
+          <w:color w:val="64748B"/>
+          <w:sz w:val="18"/>
+        </w:rPr>
+        <w:t>Screen: Reports</w:t>
+      </w:r>
+    </w:p>
+    <w:p>
+      <w:r>
+        <w:rPr>
+          <w:b/>
+          <w:i w:val="0"/>
+        </w:rPr>
+        <w:t>Reports → Customer-wise Sales</w:t>
+      </w:r>
+      <w:r>
+        <w:rPr>
+          <w:b w:val="0"/>
+          <w:i w:val="0"/>
+        </w:rPr>
+        <w:t xml:space="preserve">: bills, billed, returned, </w:t>
+      </w:r>
+      <w:r>
+        <w:rPr>
+          <w:b/>
+          <w:i w:val="0"/>
+        </w:rPr>
+        <w:t>net sales</w:t>
+      </w:r>
+      <w:r>
+        <w:rPr>
+          <w:b w:val="0"/>
+          <w:i w:val="0"/>
+        </w:rPr>
+        <w:t xml:space="preserve"> and what each customer </w:t>
+      </w:r>
+      <w:r>
+        <w:rPr>
+          <w:b/>
+          <w:i w:val="0"/>
+        </w:rPr>
+        <w:t>owes now</w:t>
+      </w:r>
+      <w:r>
+        <w:rPr>
+          <w:b w:val="0"/>
+          <w:i w:val="0"/>
+        </w:rPr>
+        <w:t>.</w:t>
+      </w:r>
+    </w:p>
+    <w:p>
+      <w:pPr>
+        <w:jc w:val="center"/>
+      </w:pPr>
+      <w:r>
+        <w:drawing>
+          <wp:inline xmlns:a="http://schemas.openxmlformats.org/drawingml/2006/main" xmlns:pic="http://schemas.openxmlformats.org/drawingml/2006/picture">
+            <wp:extent cx="6120000" cy="3902609"/>
+            <wp:docPr id="71" name="Picture 71"/>
+            <wp:cNvGraphicFramePr>
+              <a:graphicFrameLocks noChangeAspect="1"/>
+            </wp:cNvGraphicFramePr>
+            <a:graphic>
+              <a:graphicData uri="http://schemas.openxmlformats.org/drawingml/2006/picture">
+                <pic:pic>
+                  <pic:nvPicPr>
+                    <pic:cNvPr id="0" name="102-customer-wise-sales.png"/>
+                    <pic:cNvPicPr/>
+                  </pic:nvPicPr>
+                  <pic:blipFill>
+                    <a:blip r:embed="rId78"/>
+                    <a:stretch>
+                      <a:fillRect/>
+                    </a:stretch>
+                  </pic:blipFill>
+                  <pic:spPr>
+                    <a:xfrm>
+                      <a:off x="0" y="0"/>
+                      <a:ext cx="6120000" cy="3902609"/>
+                    </a:xfrm>
+                    <a:prstGeom prst="rect"/>
+                  </pic:spPr>
+                </pic:pic>
+              </a:graphicData>
+            </a:graphic>
+          </wp:inline>
+        </w:drawing>
+      </w:r>
+    </w:p>
+    <w:p>
+      <w:pPr>
+        <w:jc w:val="center"/>
+      </w:pPr>
+      <w:r>
+        <w:rPr>
+          <w:i/>
+          <w:color w:val="64748B"/>
+          <w:sz w:val="18"/>
+        </w:rPr>
         <w:t>Customer-wise sales</w:t>
       </w:r>
     </w:p>
@@ -20784,11 +20812,11 @@
               <a:graphicData uri="http://schemas.openxmlformats.org/drawingml/2006/picture">
                 <pic:pic>
                   <pic:nvPicPr>
-                    <pic:cNvPr id="0" name="103-report-calendar.png"/>
+                    <pic:cNvPr id="0" name="100-daybook.png"/>
                     <pic:cNvPicPr/>
                   </pic:nvPicPr>
                   <pic:blipFill>
-                    <a:blip r:embed="rId78"/>
+                    <a:blip r:embed="rId76"/>
                     <a:stretch>
                       <a:fillRect/>
                     </a:stretch>
@@ -21772,7 +21800,238 @@
           <w:b w:val="0"/>
           <w:i w:val="0"/>
         </w:rPr>
-        <w:t xml:space="preserve"> decides which menus a person sees. A forgotten password is reset by the administrator with </w:t>
+        <w:t xml:space="preserve"> decides which menus a person sees:</w:t>
+      </w:r>
+    </w:p>
+    <w:tbl>
+      <w:tblPr>
+        <w:tblStyle w:val="TableGrid"/>
+        <w:tblW w:type="auto" w:w="0"/>
+        <w:tblLook w:firstColumn="1" w:firstRow="1" w:lastColumn="0" w:lastRow="0" w:noHBand="0" w:noVBand="1" w:val="04A0"/>
+      </w:tblPr>
+      <w:tblGrid>
+        <w:gridCol w:w="4986"/>
+        <w:gridCol w:w="4986"/>
+      </w:tblGrid>
+      <w:tr>
+        <w:tc>
+          <w:tcPr>
+            <w:tcW w:type="dxa" w:w="4986"/>
+            <w:shd w:val="clear" w:color="auto" w:fill="E0E7FF"/>
+          </w:tcPr>
+          <w:p>
+            <w:r/>
+            <w:r>
+              <w:rPr>
+                <w:b/>
+                <w:i w:val="0"/>
+                <w:sz w:val="19"/>
+              </w:rPr>
+              <w:t>Role</w:t>
+            </w:r>
+          </w:p>
+        </w:tc>
+        <w:tc>
+          <w:tcPr>
+            <w:tcW w:type="dxa" w:w="4986"/>
+            <w:shd w:val="clear" w:color="auto" w:fill="E0E7FF"/>
+          </w:tcPr>
+          <w:p>
+            <w:r/>
+            <w:r>
+              <w:rPr>
+                <w:b/>
+                <w:i w:val="0"/>
+                <w:sz w:val="19"/>
+              </w:rPr>
+              <w:t>Sees</w:t>
+            </w:r>
+          </w:p>
+        </w:tc>
+      </w:tr>
+      <w:tr>
+        <w:tc>
+          <w:tcPr>
+            <w:tcW w:type="dxa" w:w="4986"/>
+          </w:tcPr>
+          <w:p>
+            <w:r/>
+            <w:r>
+              <w:rPr>
+                <w:b/>
+                <w:i w:val="0"/>
+                <w:sz w:val="19"/>
+              </w:rPr>
+              <w:t>user</w:t>
+            </w:r>
+            <w:r>
+              <w:rPr>
+                <w:b w:val="0"/>
+                <w:i w:val="0"/>
+                <w:sz w:val="19"/>
+              </w:rPr>
+              <w:t xml:space="preserve"> (cashier)</w:t>
+            </w:r>
+          </w:p>
+        </w:tc>
+        <w:tc>
+          <w:tcPr>
+            <w:tcW w:type="dxa" w:w="4986"/>
+          </w:tcPr>
+          <w:p>
+            <w:r/>
+            <w:r>
+              <w:rPr>
+                <w:b w:val="0"/>
+                <w:i w:val="0"/>
+                <w:sz w:val="19"/>
+              </w:rPr>
+              <w:t>File (billing, orders, purchases), Bills History, Bills Consolidated Report, Order Consolidation, Dashboard, Help</w:t>
+            </w:r>
+          </w:p>
+        </w:tc>
+      </w:tr>
+      <w:tr>
+        <w:tc>
+          <w:tcPr>
+            <w:tcW w:type="dxa" w:w="4986"/>
+          </w:tcPr>
+          <w:p>
+            <w:r/>
+            <w:r>
+              <w:rPr>
+                <w:b/>
+                <w:i w:val="0"/>
+                <w:sz w:val="19"/>
+              </w:rPr>
+              <w:t>manager</w:t>
+            </w:r>
+          </w:p>
+        </w:tc>
+        <w:tc>
+          <w:tcPr>
+            <w:tcW w:type="dxa" w:w="4986"/>
+          </w:tcPr>
+          <w:p>
+            <w:r/>
+            <w:r>
+              <w:rPr>
+                <w:b w:val="0"/>
+                <w:i w:val="0"/>
+                <w:sz w:val="19"/>
+              </w:rPr>
+              <w:t xml:space="preserve">all of the above, plus </w:t>
+            </w:r>
+            <w:r>
+              <w:rPr>
+                <w:b/>
+                <w:i w:val="0"/>
+                <w:sz w:val="19"/>
+              </w:rPr>
+              <w:t>Masters</w:t>
+            </w:r>
+            <w:r>
+              <w:rPr>
+                <w:b w:val="0"/>
+                <w:i w:val="0"/>
+                <w:sz w:val="19"/>
+              </w:rPr>
+              <w:t xml:space="preserve"> (items, customers, suppliers, inventory, waste, fixed rates), </w:t>
+            </w:r>
+            <w:r>
+              <w:rPr>
+                <w:b/>
+                <w:i w:val="0"/>
+                <w:sz w:val="19"/>
+              </w:rPr>
+              <w:t>Accounts</w:t>
+            </w:r>
+            <w:r>
+              <w:rPr>
+                <w:b w:val="0"/>
+                <w:i w:val="0"/>
+                <w:sz w:val="19"/>
+              </w:rPr>
+              <w:t xml:space="preserve">, </w:t>
+            </w:r>
+            <w:r>
+              <w:rPr>
+                <w:b/>
+                <w:i w:val="0"/>
+                <w:sz w:val="19"/>
+              </w:rPr>
+              <w:t>Daybook</w:t>
+            </w:r>
+            <w:r>
+              <w:rPr>
+                <w:b w:val="0"/>
+                <w:i w:val="0"/>
+                <w:sz w:val="19"/>
+              </w:rPr>
+              <w:t>, item-wise and customer-wise sales, Profit &amp; Loss, Balance Sheet</w:t>
+            </w:r>
+          </w:p>
+        </w:tc>
+      </w:tr>
+      <w:tr>
+        <w:tc>
+          <w:tcPr>
+            <w:tcW w:type="dxa" w:w="4986"/>
+          </w:tcPr>
+          <w:p>
+            <w:r/>
+            <w:r>
+              <w:rPr>
+                <w:b/>
+                <w:i w:val="0"/>
+                <w:sz w:val="19"/>
+              </w:rPr>
+              <w:t>admin</w:t>
+            </w:r>
+          </w:p>
+        </w:tc>
+        <w:tc>
+          <w:tcPr>
+            <w:tcW w:type="dxa" w:w="4986"/>
+          </w:tcPr>
+          <w:p>
+            <w:r/>
+            <w:r>
+              <w:rPr>
+                <w:b w:val="0"/>
+                <w:i w:val="0"/>
+                <w:sz w:val="19"/>
+              </w:rPr>
+              <w:t xml:space="preserve">everything, including </w:t>
+            </w:r>
+            <w:r>
+              <w:rPr>
+                <w:b/>
+                <w:i w:val="0"/>
+                <w:sz w:val="19"/>
+              </w:rPr>
+              <w:t>Settings</w:t>
+            </w:r>
+            <w:r>
+              <w:rPr>
+                <w:b w:val="0"/>
+                <w:i w:val="0"/>
+                <w:sz w:val="19"/>
+              </w:rPr>
+              <w:t xml:space="preserve"> (users, company, database, audit logs)</w:t>
+            </w:r>
+          </w:p>
+        </w:tc>
+      </w:tr>
+    </w:tbl>
+    <w:p/>
+    <w:p>
+      <w:r>
+        <w:rPr>
+          <w:b w:val="0"/>
+          <w:i w:val="0"/>
+        </w:rPr>
+        <w:t xml:space="preserve">A menu never offers a screen you cannot open. A forgotten password is reset by the administrator with </w:t>
       </w:r>
       <w:r>
         <w:rPr>
@@ -22490,7 +22749,67 @@
           <w:b w:val="0"/>
           <w:i w:val="0"/>
         </w:rPr>
-        <w:t xml:space="preserve"> lists what users did and when, so you can see who made, voided or changed something.</w:t>
+        <w:t xml:space="preserve"> answers </w:t>
+      </w:r>
+      <w:r>
+        <w:rPr>
+          <w:b w:val="0"/>
+          <w:i/>
+        </w:rPr>
+        <w:t>who did what, and when</w:t>
+      </w:r>
+      <w:r>
+        <w:rPr>
+          <w:b w:val="0"/>
+          <w:i w:val="0"/>
+        </w:rPr>
+        <w:t>. Nothing on it can be changed. It has two lists:</w:t>
+      </w:r>
+    </w:p>
+    <w:p>
+      <w:pPr>
+        <w:spacing w:after="40"/>
+        <w:ind w:left="510" w:hanging="312"/>
+      </w:pPr>
+      <w:r>
+        <w:t xml:space="preserve">1.  </w:t>
+      </w:r>
+      <w:r>
+        <w:rPr>
+          <w:b/>
+          <w:i w:val="0"/>
+        </w:rPr>
+        <w:t>Bill changes:</w:t>
+      </w:r>
+      <w:r>
+        <w:rPr>
+          <w:b w:val="0"/>
+          <w:i w:val="0"/>
+        </w:rPr>
+        <w:t xml:space="preserve"> every time a bill was made, voided, or had goods returned (or a return cancelled): the time, the user, the invoice, the action and, where something changed, what it was before and after.</w:t>
+      </w:r>
+    </w:p>
+    <w:p>
+      <w:pPr>
+        <w:spacing w:after="40"/>
+        <w:ind w:left="510" w:hanging="312"/>
+      </w:pPr>
+      <w:r>
+        <w:t xml:space="preserve">2.  </w:t>
+      </w:r>
+      <w:r>
+        <w:rPr>
+          <w:b/>
+          <w:i w:val="0"/>
+        </w:rPr>
+        <w:t>Sign-ins and activity:</w:t>
+      </w:r>
+      <w:r>
+        <w:rPr>
+          <w:b w:val="0"/>
+          <w:i w:val="0"/>
+        </w:rPr>
+        <w:t xml:space="preserve"> who signed in and when.</w:t>
       </w:r>
     </w:p>
     <w:p>
@@ -22542,7 +22861,163 @@
           <w:color w:val="64748B"/>
           <w:sz w:val="18"/>
         </w:rPr>
-        <w:t>Audit logs</w:t>
+        <w:t>Audit logs: bill changes</w:t>
+      </w:r>
+    </w:p>
+    <w:p>
+      <w:pPr>
+        <w:jc w:val="center"/>
+      </w:pPr>
+      <w:r>
+        <w:drawing>
+          <wp:inline xmlns:a="http://schemas.openxmlformats.org/drawingml/2006/main" xmlns:pic="http://schemas.openxmlformats.org/drawingml/2006/picture">
+            <wp:extent cx="6120000" cy="3902609"/>
+            <wp:docPr id="82" name="Picture 82"/>
+            <wp:cNvGraphicFramePr>
+              <a:graphicFrameLocks noChangeAspect="1"/>
+            </wp:cNvGraphicFramePr>
+            <a:graphic>
+              <a:graphicData uri="http://schemas.openxmlformats.org/drawingml/2006/picture">
+                <pic:pic>
+                  <pic:nvPicPr>
+                    <pic:cNvPr id="0" name="118-audit-logs-activity.png"/>
+                    <pic:cNvPicPr/>
+                  </pic:nvPicPr>
+                  <pic:blipFill>
+                    <a:blip r:embed="rId88"/>
+                    <a:stretch>
+                      <a:fillRect/>
+                    </a:stretch>
+                  </pic:blipFill>
+                  <pic:spPr>
+                    <a:xfrm>
+                      <a:off x="0" y="0"/>
+                      <a:ext cx="6120000" cy="3902609"/>
+                    </a:xfrm>
+                    <a:prstGeom prst="rect"/>
+                  </pic:spPr>
+                </pic:pic>
+              </a:graphicData>
+            </a:graphic>
+          </wp:inline>
+        </w:drawing>
+      </w:r>
+    </w:p>
+    <w:p>
+      <w:pPr>
+        <w:jc w:val="center"/>
+      </w:pPr>
+      <w:r>
+        <w:rPr>
+          <w:i/>
+          <w:color w:val="64748B"/>
+          <w:sz w:val="18"/>
+        </w:rPr>
+        <w:t>Audit logs: sign-ins</w:t>
+      </w:r>
+    </w:p>
+    <w:p>
+      <w:pPr>
+        <w:spacing w:after="40"/>
+        <w:ind w:left="510" w:hanging="312"/>
+      </w:pPr>
+      <w:r>
+        <w:t xml:space="preserve">•  </w:t>
+      </w:r>
+      <w:r>
+        <w:rPr>
+          <w:b/>
+          <w:i w:val="0"/>
+        </w:rPr>
+        <w:t>From / To</w:t>
+      </w:r>
+      <w:r>
+        <w:rPr>
+          <w:b w:val="0"/>
+          <w:i w:val="0"/>
+        </w:rPr>
+        <w:t xml:space="preserve"> (calendar boxes), </w:t>
+      </w:r>
+      <w:r>
+        <w:rPr>
+          <w:b/>
+          <w:i w:val="0"/>
+        </w:rPr>
+        <w:t>Action</w:t>
+      </w:r>
+      <w:r>
+        <w:rPr>
+          <w:b w:val="0"/>
+          <w:i w:val="0"/>
+        </w:rPr>
+        <w:t xml:space="preserve"> (All, or one kind), and </w:t>
+      </w:r>
+      <w:r>
+        <w:rPr>
+          <w:b/>
+          <w:i w:val="0"/>
+        </w:rPr>
+        <w:t>Search</w:t>
+      </w:r>
+      <w:r>
+        <w:rPr>
+          <w:b w:val="0"/>
+          <w:i w:val="0"/>
+        </w:rPr>
+        <w:t xml:space="preserve"> (any word: a user, an invoice number) narrow the list; press </w:t>
+      </w:r>
+      <w:r>
+        <w:rPr>
+          <w:b/>
+          <w:i w:val="0"/>
+        </w:rPr>
+        <w:t>Show</w:t>
+      </w:r>
+      <w:r>
+        <w:rPr>
+          <w:b w:val="0"/>
+          <w:i w:val="0"/>
+        </w:rPr>
+        <w:t xml:space="preserve"> or Enter.</w:t>
+      </w:r>
+    </w:p>
+    <w:p>
+      <w:pPr>
+        <w:spacing w:after="40"/>
+        <w:ind w:left="510" w:hanging="312"/>
+      </w:pPr>
+      <w:r>
+        <w:t xml:space="preserve">•  </w:t>
+      </w:r>
+      <w:r>
+        <w:rPr>
+          <w:b/>
+          <w:i w:val="0"/>
+        </w:rPr>
+        <w:t>Export CSV</w:t>
+      </w:r>
+      <w:r>
+        <w:rPr>
+          <w:b w:val="0"/>
+          <w:i w:val="0"/>
+        </w:rPr>
+        <w:t xml:space="preserve"> saves what is on screen.</w:t>
+      </w:r>
+    </w:p>
+    <w:p>
+      <w:pPr>
+        <w:spacing w:after="40"/>
+        <w:ind w:left="510" w:hanging="312"/>
+      </w:pPr>
+      <w:r>
+        <w:t xml:space="preserve">•  </w:t>
+      </w:r>
+      <w:r>
+        <w:rPr>
+          <w:b w:val="0"/>
+          <w:i w:val="0"/>
+        </w:rPr>
+        <w:t>The newest 2,000 entries are listed; use the dates to look further back.</w:t>
       </w:r>
     </w:p>
     <w:p>
@@ -22973,7 +23448,7 @@
                 <w:i w:val="0"/>
                 <w:sz w:val="19"/>
               </w:rPr>
-              <w:t>Supplier Master (from Dashboard); refresh</w:t>
+              <w:t>refresh the screen</w:t>
             </w:r>
           </w:p>
         </w:tc>
@@ -23321,7 +23796,7 @@
                 <w:i w:val="0"/>
                 <w:sz w:val="19"/>
               </w:rPr>
-              <w:t>Customer Master</w:t>
+              <w:t>Supplier Master</w:t>
             </w:r>
           </w:p>
         </w:tc>
@@ -23455,6 +23930,56 @@
               </w:rPr>
               <w:t>close the form</w:t>
             </w:r>
+          </w:p>
+        </w:tc>
+      </w:tr>
+      <w:tr>
+        <w:tc>
+          <w:tcPr>
+            <w:tcW w:type="dxa" w:w="2493"/>
+          </w:tcPr>
+          <w:p>
+            <w:r/>
+            <w:r>
+              <w:rPr>
+                <w:b/>
+                <w:i w:val="0"/>
+                <w:sz w:val="19"/>
+              </w:rPr>
+              <w:t>Ctrl+N</w:t>
+            </w:r>
+          </w:p>
+        </w:tc>
+        <w:tc>
+          <w:tcPr>
+            <w:tcW w:type="dxa" w:w="2493"/>
+          </w:tcPr>
+          <w:p>
+            <w:r/>
+            <w:r>
+              <w:rPr>
+                <w:b w:val="0"/>
+                <w:i w:val="0"/>
+                <w:sz w:val="19"/>
+              </w:rPr>
+              <w:t>New Customer Order</w:t>
+            </w:r>
+          </w:p>
+        </w:tc>
+        <w:tc>
+          <w:tcPr>
+            <w:tcW w:type="dxa" w:w="2493"/>
+          </w:tcPr>
+          <w:p>
+            <w:r/>
+          </w:p>
+        </w:tc>
+        <w:tc>
+          <w:tcPr>
+            <w:tcW w:type="dxa" w:w="2493"/>
+          </w:tcPr>
+          <w:p>
+            <w:r/>
           </w:p>
         </w:tc>
       </w:tr>
@@ -31971,6 +32496,18 @@
       <w:r>
         <w:t xml:space="preserve">f11 — </w:t>
       </w:r>
+      <w:hyperlink w:anchor="suppliers">
+        <w:r>
+          <w:rPr>
+            <w:color w:val="4F46E5"/>
+            <w:u w:val="single"/>
+          </w:rPr>
+          <w:t xml:space="preserve">5.3</w:t>
+        </w:r>
+      </w:hyperlink>
+      <w:r>
+        <w:t xml:space="preserve">, </w:t>
+      </w:r>
       <w:hyperlink w:anchor="shortcuts">
         <w:r>
           <w:rPr>
@@ -32157,18 +32694,6 @@
       <w:r>
         <w:t xml:space="preserve">, </w:t>
       </w:r>
-      <w:hyperlink w:anchor="suppliers">
-        <w:r>
-          <w:rPr>
-            <w:color w:val="4F46E5"/>
-            <w:u w:val="single"/>
-          </w:rPr>
-          <w:t xml:space="preserve">5.3</w:t>
-        </w:r>
-      </w:hyperlink>
-      <w:r>
-        <w:t xml:space="preserve">, </w:t>
-      </w:r>
       <w:hyperlink w:anchor="shortcuts">
         <w:r>
           <w:rPr>
@@ -39266,7 +39791,7 @@
       </w:hyperlink>
     </w:p>
     <w:sectPr>
-      <w:footerReference w:type="default" r:id="rId88"/>
+      <w:footerReference w:type="default" r:id="rId89"/>
       <w:pgSz w:w="12240" w:h="15840"/>
       <w:pgMar w:top="1134" w:right="1134" w:bottom="1134" w:left="1134" w:header="720" w:footer="720" w:gutter="0"/>
       <w:cols w:space="720"/>

</xml_diff>